<commit_message>
Complete VAT incidence analysis using CEQ framework: estimation of effective tax rates, concentration measures (Gini and Kakwani), distributional results, robustness analysis, and figure production
</commit_message>
<xml_diff>
--- a/doc/Note Methodologique Ceq Tva Ehcvm CI.docx
+++ b/doc/Note Methodologique Ceq Tva Ehcvm CI.docx
@@ -6,24 +6,21 @@
       <w:pPr>
         <w:pStyle w:val="Heading1"/>
         <w:rPr>
+          <w:b/>
+          <w:bCs/>
+          <w:u w:val="single"/>
           <w:lang w:val="fr-FR"/>
         </w:rPr>
       </w:pPr>
       <w:bookmarkStart w:id="0" w:name="note-méthodologique-de-recherche"/>
       <w:r>
         <w:rPr>
-          <w:lang w:val="fr-FR"/>
-        </w:rPr>
-        <w:t xml:space="preserve">Note </w:t>
-      </w:r>
-      <w:r>
-        <w:t>méthodologique</w:t>
-      </w:r>
-      <w:r>
-        <w:rPr>
-          <w:lang w:val="fr-FR"/>
-        </w:rPr>
-        <w:t xml:space="preserve"> </w:t>
+          <w:b/>
+          <w:bCs/>
+          <w:u w:val="single"/>
+          <w:lang w:val="fr-FR"/>
+        </w:rPr>
+        <w:t xml:space="preserve">Note méthodologique </w:t>
       </w:r>
     </w:p>
     <w:p>
@@ -32,6 +29,7 @@
         <w:rPr>
           <w:rFonts w:ascii="Arial" w:hAnsi="Arial" w:cs="Arial"/>
           <w:color w:val="auto"/>
+          <w:u w:val="single"/>
           <w:lang w:val="fr-FR"/>
         </w:rPr>
       </w:pPr>
@@ -40,6 +38,7 @@
         <w:rPr>
           <w:rFonts w:ascii="Arial" w:hAnsi="Arial" w:cs="Arial"/>
           <w:color w:val="auto"/>
+          <w:u w:val="single"/>
           <w:lang w:val="fr-FR"/>
         </w:rPr>
         <w:t>Mesure de l’incidence distributive des taxes indirectes en Côte d’Ivoire à partir des données EHCVM</w:t>
@@ -51,6 +50,7 @@
         <w:rPr>
           <w:rFonts w:ascii="Arial" w:hAnsi="Arial" w:cs="Arial"/>
           <w:color w:val="auto"/>
+          <w:u w:val="single"/>
           <w:lang w:val="fr-FR"/>
         </w:rPr>
       </w:pPr>
@@ -60,6 +60,7 @@
         <w:rPr>
           <w:rFonts w:ascii="Arial" w:hAnsi="Arial" w:cs="Arial"/>
           <w:color w:val="auto"/>
+          <w:u w:val="single"/>
           <w:lang w:val="fr-FR"/>
         </w:rPr>
         <w:t xml:space="preserve">Version </w:t>
@@ -68,6 +69,7 @@
         <w:rPr>
           <w:rFonts w:ascii="Arial" w:hAnsi="Arial" w:cs="Arial"/>
           <w:color w:val="auto"/>
+          <w:u w:val="single"/>
           <w:lang w:val="fr-FR"/>
         </w:rPr>
         <w:t>0</w:t>
@@ -84,8 +86,13 @@
     <w:p>
       <w:pPr>
         <w:pStyle w:val="Heading2"/>
-        <w:rPr>
-          <w:rFonts w:ascii="Arial" w:hAnsi="Arial" w:cs="Arial"/>
+        <w:numPr>
+          <w:ilvl w:val="0"/>
+          <w:numId w:val="36"/>
+        </w:numPr>
+        <w:rPr>
+          <w:rFonts w:ascii="Arial" w:hAnsi="Arial" w:cs="Arial"/>
+          <w:u w:val="single"/>
           <w:lang w:val="fr-FR"/>
         </w:rPr>
       </w:pPr>
@@ -93,300 +100,318 @@
       <w:bookmarkEnd w:id="2"/>
       <w:r>
         <w:rPr>
-          <w:rFonts w:ascii="Arial" w:hAnsi="Arial" w:cs="Arial"/>
-          <w:lang w:val="fr-FR"/>
-        </w:rPr>
-        <w:t>1. Titre provisoire du projet</w:t>
+          <w:rStyle w:val="TitleChar"/>
+          <w:lang w:val="fr-FR"/>
+        </w:rPr>
+        <w:t>Titre provisoire du projet</w:t>
       </w:r>
     </w:p>
     <w:p>
       <w:pPr>
         <w:pStyle w:val="FirstParagraph"/>
-        <w:rPr>
-          <w:rFonts w:ascii="Arial" w:hAnsi="Arial" w:cs="Arial"/>
-          <w:lang w:val="fr-FR"/>
-        </w:rPr>
-      </w:pPr>
-      <w:r>
+        <w:jc w:val="both"/>
+        <w:rPr>
+          <w:rFonts w:ascii="Arial" w:hAnsi="Arial" w:cs="Arial"/>
+          <w:lang w:val="fr-FR"/>
+        </w:rPr>
+      </w:pPr>
+      <w:r>
+        <w:rPr>
+          <w:rFonts w:ascii="Arial" w:hAnsi="Arial" w:cs="Arial"/>
+          <w:lang w:val="fr-FR"/>
+        </w:rPr>
+        <w:t>Mesurer l’incidence distributive de la fiscalité indirecte en Côte d’Ivoire : une adaptation de l’approche CEQ à partir des données de consommation de l’EHCVM</w:t>
+      </w:r>
+      <w:r>
+        <w:rPr>
+          <w:rFonts w:ascii="Arial" w:hAnsi="Arial" w:cs="Arial"/>
+          <w:lang w:val="fr-FR"/>
+        </w:rPr>
+        <w:t xml:space="preserve"> 2021</w:t>
+      </w:r>
+    </w:p>
+    <w:p>
+      <w:pPr>
+        <w:rPr>
+          <w:rFonts w:ascii="Arial" w:hAnsi="Arial" w:cs="Arial"/>
+          <w:lang w:val="fr-FR"/>
+        </w:rPr>
+      </w:pPr>
+    </w:p>
+    <w:p>
+      <w:pPr>
+        <w:pStyle w:val="Title"/>
+        <w:numPr>
+          <w:ilvl w:val="0"/>
+          <w:numId w:val="36"/>
+        </w:numPr>
+        <w:jc w:val="left"/>
+        <w:rPr>
+          <w:lang w:val="fr-FR"/>
+        </w:rPr>
+      </w:pPr>
+      <w:bookmarkStart w:id="4" w:name="résumé-exécutif"/>
+      <w:bookmarkEnd w:id="3"/>
+      <w:r>
+        <w:rPr>
+          <w:lang w:val="fr-FR"/>
+        </w:rPr>
+        <w:t>Résumé exécutif</w:t>
+      </w:r>
+    </w:p>
+    <w:p>
+      <w:pPr>
+        <w:pStyle w:val="FirstParagraph"/>
+        <w:jc w:val="both"/>
+        <w:rPr>
+          <w:rFonts w:ascii="Arial" w:hAnsi="Arial" w:cs="Arial"/>
+          <w:lang w:val="fr-FR"/>
+        </w:rPr>
+      </w:pPr>
+      <w:r>
+        <w:rPr>
+          <w:rFonts w:ascii="Arial" w:hAnsi="Arial" w:cs="Arial"/>
+          <w:lang w:val="fr-FR"/>
+        </w:rPr>
+        <w:t>Cette note présente une stratégie méthodologique pour démarrer une analyse d’incidence fiscale en Côte d’Ivoire à partir des seules données actuellement disponibles, soit la base de consommation détaillée de l’EHCVM 20</w:t>
+      </w:r>
+      <w:r>
+        <w:rPr>
+          <w:rFonts w:ascii="Arial" w:hAnsi="Arial" w:cs="Arial"/>
+          <w:lang w:val="fr-FR"/>
+        </w:rPr>
+        <w:t>21</w:t>
+      </w:r>
+      <w:r>
+        <w:rPr>
+          <w:rFonts w:ascii="Arial" w:hAnsi="Arial" w:cs="Arial"/>
+          <w:lang w:val="fr-FR"/>
+        </w:rPr>
+        <w:t>. L’objectif n’est pas de reproduire immédiatement une évaluation CEQ complète, mais de construire une première architecture analytique rigoureuse, transparente et améliorable, permettant d’estimer l’incidence distributive des taxes indirectes supportées par les ménages.</w:t>
+      </w:r>
+    </w:p>
+    <w:p>
+      <w:pPr>
+        <w:pStyle w:val="BodyText"/>
+        <w:jc w:val="both"/>
+        <w:rPr>
+          <w:rFonts w:ascii="Arial" w:hAnsi="Arial" w:cs="Arial"/>
+          <w:lang w:val="fr-FR"/>
+        </w:rPr>
+      </w:pPr>
+      <w:r>
+        <w:rPr>
+          <w:rFonts w:ascii="Arial" w:hAnsi="Arial" w:cs="Arial"/>
+          <w:lang w:val="fr-FR"/>
+        </w:rPr>
+        <w:t>Le point de départ est simple : la base disponible observe les dépenses annuelles des ménages, à un niveau très fin de produits, via le code produit (</w:t>
+      </w:r>
+      <w:proofErr w:type="spellStart"/>
+      <w:r>
+        <w:rPr>
+          <w:rStyle w:val="VerbatimChar"/>
+          <w:rFonts w:ascii="Arial" w:hAnsi="Arial" w:cs="Arial"/>
+          <w:i/>
+          <w:iCs/>
+          <w:lang w:val="fr-FR"/>
+        </w:rPr>
+        <w:t>codpr</w:t>
+      </w:r>
+      <w:proofErr w:type="spellEnd"/>
+      <w:r>
+        <w:rPr>
+          <w:rFonts w:ascii="Arial" w:hAnsi="Arial" w:cs="Arial"/>
+          <w:lang w:val="fr-FR"/>
+        </w:rPr>
+        <w:t>), le mode d’acquisition (</w:t>
+      </w:r>
+      <w:proofErr w:type="spellStart"/>
+      <w:r>
+        <w:rPr>
+          <w:rStyle w:val="VerbatimChar"/>
+          <w:rFonts w:ascii="Arial" w:hAnsi="Arial" w:cs="Arial"/>
+          <w:i/>
+          <w:iCs/>
+          <w:lang w:val="fr-FR"/>
+        </w:rPr>
+        <w:t>modep</w:t>
+      </w:r>
+      <w:proofErr w:type="spellEnd"/>
+      <w:r>
+        <w:rPr>
+          <w:rFonts w:ascii="Arial" w:hAnsi="Arial" w:cs="Arial"/>
+          <w:lang w:val="fr-FR"/>
+        </w:rPr>
+        <w:t>), la dépense annuelle (</w:t>
+      </w:r>
+      <w:proofErr w:type="spellStart"/>
+      <w:r>
+        <w:rPr>
+          <w:rStyle w:val="VerbatimChar"/>
+          <w:rFonts w:ascii="Arial" w:hAnsi="Arial" w:cs="Arial"/>
+          <w:i/>
+          <w:iCs/>
+          <w:lang w:val="fr-FR"/>
+        </w:rPr>
+        <w:t>depan</w:t>
+      </w:r>
+      <w:proofErr w:type="spellEnd"/>
+      <w:r>
+        <w:rPr>
+          <w:rFonts w:ascii="Arial" w:hAnsi="Arial" w:cs="Arial"/>
+          <w:lang w:val="fr-FR"/>
+        </w:rPr>
+        <w:t>) et la pondération (</w:t>
+      </w:r>
+      <w:proofErr w:type="spellStart"/>
+      <w:r>
+        <w:rPr>
+          <w:rStyle w:val="VerbatimChar"/>
+          <w:rFonts w:ascii="Arial" w:hAnsi="Arial" w:cs="Arial"/>
+          <w:i/>
+          <w:iCs/>
+          <w:lang w:val="fr-FR"/>
+        </w:rPr>
+        <w:t>hhweight</w:t>
+      </w:r>
+      <w:proofErr w:type="spellEnd"/>
+      <w:r>
+        <w:rPr>
+          <w:rFonts w:ascii="Arial" w:hAnsi="Arial" w:cs="Arial"/>
+          <w:lang w:val="fr-FR"/>
+        </w:rPr>
+        <w:t>). En revanche, elle ne contient ni information directe sur les impôts payés, ni estimation fiable et complète des revenus de marché, ni valorisation des transferts en nature comme l’éducation et la santé. Dans ce contexte, une application intégrale de l’approche CEQ n’est pas immédiatement possible. Une adaptation méthodologiquement défendable consiste alors à mobiliser la composante la plus faisable et la plus informative dans l’état actuel des données : l’analyse du passage du revenu de marché approximé vers le revenu consommable, en simulant la charge des taxes indirectes sur la consommation des ménages.</w:t>
+      </w:r>
+    </w:p>
+    <w:p>
+      <w:pPr>
+        <w:pStyle w:val="BodyText"/>
+        <w:jc w:val="both"/>
+        <w:rPr>
+          <w:rFonts w:ascii="Arial" w:hAnsi="Arial" w:cs="Arial"/>
+          <w:lang w:val="fr-FR"/>
+        </w:rPr>
+      </w:pPr>
+      <w:r>
+        <w:rPr>
+          <w:rFonts w:ascii="Arial" w:hAnsi="Arial" w:cs="Arial"/>
+          <w:lang w:val="fr-FR"/>
+        </w:rPr>
+        <w:t xml:space="preserve">L’idée centrale est d’utiliser la consommation totale du ménage comme proxy du niveau de vie pré-fiscal, puis d’imputer une charge de TVA et, éventuellement, d’accises, à partir d’un classement fiscal des produits consommés. </w:t>
+      </w:r>
+      <w:r>
+        <w:rPr>
+          <w:rFonts w:ascii="Arial" w:hAnsi="Arial" w:cs="Arial"/>
+          <w:highlight w:val="yellow"/>
+          <w:lang w:val="fr-FR"/>
+        </w:rPr>
+        <w:t>Cette démarche permet d’estimer qui paie quoi, en niveau et en proportion du budget, selon le niveau de vie, le milieu de résidence, la région et d’autres caractéristiques qui seront ajoutées lors des fusions avec les autres fichiers ménage.</w:t>
+      </w:r>
+      <w:r>
+        <w:rPr>
+          <w:rFonts w:ascii="Arial" w:hAnsi="Arial" w:cs="Arial"/>
+          <w:lang w:val="fr-FR"/>
+        </w:rPr>
+        <w:t xml:space="preserve"> Cette approche correspond à une analyse d’incidence statique de premier ordre : elle renseigne la distribution de la charge fiscale dans la population, sans encore modéliser les effets indirects passant par les consommations intermédiaires, les réactions comportementales ou les changements d’équilibre général.</w:t>
+      </w:r>
+    </w:p>
+    <w:p>
+      <w:pPr>
+        <w:pStyle w:val="BodyText"/>
+        <w:jc w:val="both"/>
+        <w:rPr>
+          <w:rFonts w:ascii="Arial" w:hAnsi="Arial" w:cs="Arial"/>
+          <w:lang w:val="fr-FR"/>
+        </w:rPr>
+      </w:pPr>
+      <w:r>
+        <w:rPr>
+          <w:rFonts w:ascii="Arial" w:hAnsi="Arial" w:cs="Arial"/>
+          <w:lang w:val="fr-FR"/>
+        </w:rPr>
+        <w:lastRenderedPageBreak/>
+        <w:t>La note explique le cadre conceptuel de l’approche CEQ, les raisons pour lesquelles une adaptation est nécessaire dans le cas ivoirien, les choix empiriques compatibles avec les données disponibles, les hypothèses à rendre explicites, les étapes de construction des variables, les résultats attendus, les limites de cette première phase et les pistes de renforcement futur. Elle propose également une feuille de route de travail séquencée, afin que le projet puisse démarrer immédiatement sur des bases solides, documentées et crédibles.</w:t>
+      </w:r>
+    </w:p>
+    <w:p>
+      <w:pPr>
+        <w:rPr>
+          <w:rFonts w:ascii="Arial" w:hAnsi="Arial" w:cs="Arial"/>
+        </w:rPr>
+      </w:pPr>
+    </w:p>
+    <w:p>
+      <w:pPr>
+        <w:pStyle w:val="Title"/>
+        <w:numPr>
+          <w:ilvl w:val="0"/>
+          <w:numId w:val="36"/>
+        </w:numPr>
+        <w:jc w:val="left"/>
+        <w:rPr>
+          <w:lang w:val="fr-FR"/>
+        </w:rPr>
+      </w:pPr>
+      <w:bookmarkStart w:id="5" w:name="contexte-et-justification-de-létude"/>
+      <w:bookmarkEnd w:id="4"/>
+      <w:r>
+        <w:rPr>
+          <w:lang w:val="fr-FR"/>
+        </w:rPr>
+        <w:t>Contexte et justification de l’étude</w:t>
+      </w:r>
+    </w:p>
+    <w:p>
+      <w:pPr>
+        <w:pStyle w:val="FirstParagraph"/>
+        <w:jc w:val="both"/>
+        <w:rPr>
+          <w:rFonts w:ascii="Arial" w:hAnsi="Arial" w:cs="Arial"/>
+          <w:lang w:val="fr-FR"/>
+        </w:rPr>
+      </w:pPr>
+      <w:r>
+        <w:rPr>
+          <w:rFonts w:ascii="Arial" w:hAnsi="Arial" w:cs="Arial"/>
+          <w:lang w:val="fr-FR"/>
+        </w:rPr>
+        <w:t>La fiscalité indirecte occupe une place importante dans les systèmes fiscaux des pays à revenu faible ou intermédiaire. En Côte d’Ivoire, comme dans de nombreux pays d’Afrique subsaharienne, la taxe sur la valeur ajoutée et les droits d’accises constituent des sources majeures de mobilisation des recettes publiques. Du point de vue budgétaire, ces prélèvements sont stratégiques. Du point de vue distributif, leur incidence demeure toutefois une question empirique ouverte : les taxes indirectes peuvent être proportionnelles, progressives ou régressives selon la structure de consommation des ménages, le panier effectivement taxé, les exonérations, le degré d’informalité et la manière dont les entreprises répercutent les taxes dans les prix à la consommation.</w:t>
+      </w:r>
+    </w:p>
+    <w:p>
+      <w:pPr>
+        <w:pStyle w:val="BodyText"/>
+        <w:jc w:val="both"/>
+        <w:rPr>
+          <w:rFonts w:ascii="Arial" w:hAnsi="Arial" w:cs="Arial"/>
+          <w:lang w:val="fr-FR"/>
+        </w:rPr>
+      </w:pPr>
+      <w:r>
+        <w:rPr>
+          <w:rFonts w:ascii="Arial" w:hAnsi="Arial" w:cs="Arial"/>
+          <w:lang w:val="fr-FR"/>
+        </w:rPr>
+        <w:t>La littérature d’incidence fiscale a montré depuis longtemps qu’il ne suffit pas de connaître les taux légaux pour conclure sur les effets distributifs d’un instrument fiscal. Ce qui importe est l’incidence économique réelle, c’est-à-dire la répartition effective du fardeau entre groupes de population. L’approche CEQ a précisément été développée pour structurer cette analyse de manière cohérente, en suivant différents concepts de revenu avant et après interventions fiscales et sociales. Toutefois, cette approche exige normalement une combinaison de données d’enquête, de comptes nationaux, de données administratives et, selon les cas, d’hypothèses plus ou moins fortes sur la transmission des taxes.</w:t>
+      </w:r>
+    </w:p>
+    <w:p>
+      <w:pPr>
+        <w:pStyle w:val="BodyText"/>
+        <w:jc w:val="both"/>
         <w:rPr>
           <w:rFonts w:ascii="Arial" w:hAnsi="Arial" w:cs="Arial"/>
           <w:b/>
           <w:bCs/>
           <w:lang w:val="fr-FR"/>
         </w:rPr>
-        <w:t>Mesurer l’incidence distributive de la fiscalité indirecte en Côte d’Ivoire : une adaptation de l’approche CEQ à partir des données de consommation de l’EHCVM</w:t>
-      </w:r>
-    </w:p>
-    <w:p>
-      <w:pPr>
-        <w:rPr>
-          <w:rFonts w:ascii="Arial" w:hAnsi="Arial" w:cs="Arial"/>
-          <w:lang w:val="fr-FR"/>
-        </w:rPr>
-      </w:pPr>
-    </w:p>
-    <w:p>
-      <w:pPr>
-        <w:pStyle w:val="Heading2"/>
-        <w:rPr>
-          <w:rFonts w:ascii="Arial" w:hAnsi="Arial" w:cs="Arial"/>
-          <w:lang w:val="fr-FR"/>
-        </w:rPr>
-      </w:pPr>
-      <w:bookmarkStart w:id="4" w:name="résumé-exécutif"/>
-      <w:bookmarkEnd w:id="3"/>
-      <w:r>
-        <w:rPr>
-          <w:rFonts w:ascii="Arial" w:hAnsi="Arial" w:cs="Arial"/>
-          <w:lang w:val="fr-FR"/>
-        </w:rPr>
-        <w:t>2. Résumé exécutif</w:t>
-      </w:r>
-    </w:p>
-    <w:p>
-      <w:pPr>
-        <w:pStyle w:val="FirstParagraph"/>
-        <w:rPr>
-          <w:rFonts w:ascii="Arial" w:hAnsi="Arial" w:cs="Arial"/>
-          <w:lang w:val="fr-FR"/>
-        </w:rPr>
-      </w:pPr>
-      <w:r>
-        <w:rPr>
-          <w:rFonts w:ascii="Arial" w:hAnsi="Arial" w:cs="Arial"/>
-          <w:lang w:val="fr-FR"/>
-        </w:rPr>
-        <w:t>Cette note présente une stratégie méthodologique complète pour démarrer une analyse d’incidence fiscale en Côte d’Ivoire à partir des seules données actuellement disponibles, soit la base de consommation détaillée de l’EHCVM 2018. L’objectif n’est pas de reproduire immédiatement une évaluation CEQ complète, mais de construire une première architecture analytique rigoureuse, transparente et améliorable, permettant d’estimer l’incidence distributive des taxes indirectes supportées par les ménages.</w:t>
-      </w:r>
-    </w:p>
-    <w:p>
-      <w:pPr>
-        <w:pStyle w:val="BodyText"/>
-        <w:rPr>
-          <w:rFonts w:ascii="Arial" w:hAnsi="Arial" w:cs="Arial"/>
-          <w:lang w:val="fr-FR"/>
-        </w:rPr>
-      </w:pPr>
-      <w:r>
-        <w:rPr>
-          <w:rFonts w:ascii="Arial" w:hAnsi="Arial" w:cs="Arial"/>
-          <w:lang w:val="fr-FR"/>
-        </w:rPr>
-        <w:t>Le point de départ est simple : la base disponible observe les dépenses annuelles des ménages, à un niveau très fin de produits, via le code produit (</w:t>
-      </w:r>
-      <w:proofErr w:type="spellStart"/>
-      <w:r>
-        <w:rPr>
-          <w:rStyle w:val="VerbatimChar"/>
-          <w:rFonts w:ascii="Arial" w:hAnsi="Arial" w:cs="Arial"/>
-          <w:lang w:val="fr-FR"/>
-        </w:rPr>
-        <w:t>codpr</w:t>
-      </w:r>
-      <w:proofErr w:type="spellEnd"/>
-      <w:r>
-        <w:rPr>
-          <w:rFonts w:ascii="Arial" w:hAnsi="Arial" w:cs="Arial"/>
-          <w:lang w:val="fr-FR"/>
-        </w:rPr>
-        <w:t>), le mode d’acquisition (</w:t>
-      </w:r>
-      <w:proofErr w:type="spellStart"/>
-      <w:r>
-        <w:rPr>
-          <w:rStyle w:val="VerbatimChar"/>
-          <w:rFonts w:ascii="Arial" w:hAnsi="Arial" w:cs="Arial"/>
-          <w:lang w:val="fr-FR"/>
-        </w:rPr>
-        <w:t>modep</w:t>
-      </w:r>
-      <w:proofErr w:type="spellEnd"/>
-      <w:r>
-        <w:rPr>
-          <w:rFonts w:ascii="Arial" w:hAnsi="Arial" w:cs="Arial"/>
-          <w:lang w:val="fr-FR"/>
-        </w:rPr>
-        <w:t>), la dépense annuelle (</w:t>
-      </w:r>
-      <w:proofErr w:type="spellStart"/>
-      <w:r>
-        <w:rPr>
-          <w:rStyle w:val="VerbatimChar"/>
-          <w:rFonts w:ascii="Arial" w:hAnsi="Arial" w:cs="Arial"/>
-          <w:lang w:val="fr-FR"/>
-        </w:rPr>
-        <w:t>depan</w:t>
-      </w:r>
-      <w:proofErr w:type="spellEnd"/>
-      <w:r>
-        <w:rPr>
-          <w:rFonts w:ascii="Arial" w:hAnsi="Arial" w:cs="Arial"/>
-          <w:lang w:val="fr-FR"/>
-        </w:rPr>
-        <w:t>) et la pondération (</w:t>
-      </w:r>
-      <w:proofErr w:type="spellStart"/>
-      <w:r>
-        <w:rPr>
-          <w:rStyle w:val="VerbatimChar"/>
-          <w:rFonts w:ascii="Arial" w:hAnsi="Arial" w:cs="Arial"/>
-          <w:lang w:val="fr-FR"/>
-        </w:rPr>
-        <w:t>hhweight</w:t>
-      </w:r>
-      <w:proofErr w:type="spellEnd"/>
-      <w:r>
-        <w:rPr>
-          <w:rFonts w:ascii="Arial" w:hAnsi="Arial" w:cs="Arial"/>
-          <w:lang w:val="fr-FR"/>
-        </w:rPr>
-        <w:t>). En revanche, elle ne contient ni information directe sur les impôts payés, ni estimation fiable et complète des revenus de marché, ni valorisation des transferts en nature comme l’éducation et la santé. Dans ce contexte, une application intégrale de l’approche CEQ n’est pas immédiatement possible. Une adaptation méthodologiquement défendable consiste alors à mobiliser la composante la plus faisable et la plus informative dans l’état actuel des données : l’analyse du passage du revenu de marché approximé vers le revenu consommable, en simulant la charge des taxes indirectes sur la consommation des ménages.</w:t>
-      </w:r>
-    </w:p>
-    <w:p>
-      <w:pPr>
-        <w:pStyle w:val="BodyText"/>
-        <w:rPr>
-          <w:rFonts w:ascii="Arial" w:hAnsi="Arial" w:cs="Arial"/>
-          <w:lang w:val="fr-FR"/>
-        </w:rPr>
-      </w:pPr>
-      <w:r>
-        <w:rPr>
-          <w:rFonts w:ascii="Arial" w:hAnsi="Arial" w:cs="Arial"/>
-          <w:lang w:val="fr-FR"/>
-        </w:rPr>
-        <w:t>L’idée centrale est d’utiliser la consommation totale du ménage comme proxy du niveau de vie pré-fiscal, puis d’imputer une charge de TVA et, éventuellement, d’accises, à partir d’un classement fiscal des produits consommés. Cette démarche permet d’estimer qui paie quoi, en niveau et en proportion du budget, selon le niveau de vie, le milieu de résidence, la région et d’autres caractéristiques qui seront ajoutées lors des fusions avec les autres fichiers ménage. Cette approche correspond à une analyse d’incidence statique de premier ordre : elle renseigne la distribution de la charge fiscale dans la population, sans encore modéliser les effets indirects passant par les consommations intermédiaires, les réactions comportementales ou les changements d’équilibre général.</w:t>
-      </w:r>
-    </w:p>
-    <w:p>
-      <w:pPr>
-        <w:pStyle w:val="BodyText"/>
-        <w:rPr>
-          <w:rFonts w:ascii="Arial" w:hAnsi="Arial" w:cs="Arial"/>
-          <w:lang w:val="fr-FR"/>
-        </w:rPr>
-      </w:pPr>
-      <w:r>
-        <w:rPr>
-          <w:rFonts w:ascii="Arial" w:hAnsi="Arial" w:cs="Arial"/>
-          <w:lang w:val="fr-FR"/>
-        </w:rPr>
-        <w:lastRenderedPageBreak/>
-        <w:t>La note explique le cadre conceptuel de l’approche CEQ, les raisons pour lesquelles une adaptation est nécessaire dans le cas ivoirien, les choix empiriques compatibles avec les données disponibles, les hypothèses à rendre explicites, les étapes de construction des variables, les résultats attendus, les limites de cette première phase et les pistes de renforcement futur. Elle propose également une feuille de route de travail séquencée, afin que le projet puisse démarrer immédiatement sur des bases solides, documentées et crédibles.</w:t>
-      </w:r>
-    </w:p>
-    <w:p>
-      <w:pPr>
-        <w:rPr>
-          <w:rFonts w:ascii="Arial" w:hAnsi="Arial" w:cs="Arial"/>
-        </w:rPr>
-      </w:pPr>
-      <w:r>
-        <w:rPr>
-          <w:rFonts w:ascii="Arial" w:hAnsi="Arial" w:cs="Arial"/>
-        </w:rPr>
-        <w:pict w14:anchorId="18A67961">
-          <v:rect id="_x0000_i1027" style="width:0;height:1.5pt" o:hralign="center" o:hrstd="t" o:hr="t"/>
-        </w:pict>
-      </w:r>
-    </w:p>
-    <w:p>
-      <w:pPr>
-        <w:pStyle w:val="Heading2"/>
-        <w:rPr>
-          <w:rFonts w:ascii="Arial" w:hAnsi="Arial" w:cs="Arial"/>
-          <w:lang w:val="fr-FR"/>
-        </w:rPr>
-      </w:pPr>
-      <w:bookmarkStart w:id="5" w:name="contexte-et-justification-de-létude"/>
-      <w:bookmarkEnd w:id="4"/>
-      <w:r>
-        <w:rPr>
-          <w:rFonts w:ascii="Arial" w:hAnsi="Arial" w:cs="Arial"/>
-          <w:lang w:val="fr-FR"/>
-        </w:rPr>
-        <w:t>3. Contexte et justification de l’étude</w:t>
-      </w:r>
-    </w:p>
-    <w:p>
-      <w:pPr>
-        <w:pStyle w:val="FirstParagraph"/>
-        <w:rPr>
-          <w:rFonts w:ascii="Arial" w:hAnsi="Arial" w:cs="Arial"/>
-          <w:lang w:val="fr-FR"/>
-        </w:rPr>
-      </w:pPr>
-      <w:r>
-        <w:rPr>
-          <w:rFonts w:ascii="Arial" w:hAnsi="Arial" w:cs="Arial"/>
-          <w:lang w:val="fr-FR"/>
-        </w:rPr>
-        <w:t>La fiscalité indirecte occupe une place importante dans les systèmes fiscaux des pays à revenu faible ou intermédiaire. En Côte d’Ivoire, comme dans de nombreux pays d’Afrique subsaharienne, la taxe sur la valeur ajoutée et les droits d’accises constituent des sources majeures de mobilisation des recettes publiques. Du point de vue budgétaire, ces prélèvements sont stratégiques. Du point de vue distributif, leur incidence demeure toutefois une question empirique ouverte : les taxes indirectes peuvent être proportionnelles, progressives ou régressives selon la structure de consommation des ménages, le panier effectivement taxé, les exonérations, le degré d’informalité et la manière dont les entreprises répercutent les taxes dans les prix à la consommation.</w:t>
-      </w:r>
-    </w:p>
-    <w:p>
-      <w:pPr>
-        <w:pStyle w:val="BodyText"/>
-        <w:rPr>
-          <w:rFonts w:ascii="Arial" w:hAnsi="Arial" w:cs="Arial"/>
-          <w:lang w:val="fr-FR"/>
-        </w:rPr>
-      </w:pPr>
-      <w:r>
-        <w:rPr>
-          <w:rFonts w:ascii="Arial" w:hAnsi="Arial" w:cs="Arial"/>
-          <w:lang w:val="fr-FR"/>
-        </w:rPr>
-        <w:t>La littérature d’incidence fiscale a montré depuis longtemps qu’il ne suffit pas de connaître les taux légaux pour conclure sur les effets distributifs d’un instrument fiscal. Ce qui importe est l’incidence économique réelle, c’est-à-dire la répartition effective du fardeau entre groupes de population. L’approche CEQ a précisément été développée pour structurer cette analyse de manière cohérente, en suivant différents concepts de revenu avant et après interventions fiscales et sociales. Toutefois, cette approche exige normalement une combinaison de données d’enquête, de comptes nationaux, de données administratives et, selon les cas, d’hypothèses plus ou moins fortes sur la transmission des taxes.</w:t>
-      </w:r>
-    </w:p>
-    <w:p>
-      <w:pPr>
-        <w:pStyle w:val="BodyText"/>
-        <w:rPr>
-          <w:rFonts w:ascii="Arial" w:hAnsi="Arial" w:cs="Arial"/>
-          <w:lang w:val="fr-FR"/>
-        </w:rPr>
-      </w:pPr>
-      <w:r>
-        <w:rPr>
-          <w:rFonts w:ascii="Arial" w:hAnsi="Arial" w:cs="Arial"/>
-          <w:lang w:val="fr-FR"/>
-        </w:rPr>
-        <w:t xml:space="preserve">Dans le cas présent, le projet démarre avec une contrainte claire mais gérable : la disponibilité immédiate d’un fichier détaillé de consommation des ménages issu de l’EHCVM 2018. Plutôt que d’attendre d’avoir toutes les composantes d’un exercice fiscal complet, il est méthodologiquement plus pertinent de commencer par le bloc le plus observable et le plus robuste : la consommation finale des ménages. Cette stratégie présente plusieurs avantages. D’abord, elle exploite un volet de l’enquête généralement mieux mesuré que le revenu courant. Ensuite, elle permet d’entrer rapidement dans une logique de </w:t>
-      </w:r>
-      <w:proofErr w:type="spellStart"/>
-      <w:r>
-        <w:rPr>
-          <w:rFonts w:ascii="Arial" w:hAnsi="Arial" w:cs="Arial"/>
-          <w:lang w:val="fr-FR"/>
-        </w:rPr>
-        <w:t>microsimulation</w:t>
-      </w:r>
-      <w:proofErr w:type="spellEnd"/>
-      <w:r>
-        <w:rPr>
-          <w:rFonts w:ascii="Arial" w:hAnsi="Arial" w:cs="Arial"/>
-          <w:lang w:val="fr-FR"/>
-        </w:rPr>
-        <w:t xml:space="preserve"> à partir d’unités observées. Enfin, elle constitue une base solide pour des extensions ultérieures vers une évaluation plus complète intégrant la fiscalité directe, les transferts monétaires et les transferts en nature.</w:t>
-      </w:r>
-    </w:p>
-    <w:p>
-      <w:pPr>
-        <w:pStyle w:val="BodyText"/>
-        <w:rPr>
-          <w:rFonts w:ascii="Arial" w:hAnsi="Arial" w:cs="Arial"/>
-          <w:lang w:val="fr-FR"/>
-        </w:rPr>
-      </w:pPr>
-      <w:r>
-        <w:rPr>
-          <w:rFonts w:ascii="Arial" w:hAnsi="Arial" w:cs="Arial"/>
-          <w:lang w:val="fr-FR"/>
-        </w:rPr>
-        <w:t xml:space="preserve">Autrement dit, le projet ne doit pas être présenté comme une version incomplète d’une étude idéale, mais comme une première étape de recherche délibérément ciblée sur une question précisément identifiable : </w:t>
+      </w:pPr>
+      <w:r>
+        <w:rPr>
+          <w:rFonts w:ascii="Arial" w:hAnsi="Arial" w:cs="Arial"/>
+          <w:lang w:val="fr-FR"/>
+        </w:rPr>
+        <w:t xml:space="preserve">Dans le cas présent, le projet démarre avec une contrainte claire mais gérable : </w:t>
       </w:r>
       <w:r>
         <w:rPr>
@@ -395,7 +420,7 @@
           <w:bCs/>
           <w:lang w:val="fr-FR"/>
         </w:rPr>
-        <w:t xml:space="preserve">comment les taxes indirectes s’imputent-elles </w:t>
+        <w:t>la disponibilité immédiate d’un fichier détaillé de consommation des ménages issu de l’EHCVM 20</w:t>
       </w:r>
       <w:r>
         <w:rPr>
@@ -404,30 +429,79 @@
           <w:bCs/>
           <w:lang w:val="fr-FR"/>
         </w:rPr>
+        <w:t>21</w:t>
+      </w:r>
+      <w:r>
+        <w:rPr>
+          <w:rFonts w:ascii="Arial" w:hAnsi="Arial" w:cs="Arial"/>
+          <w:b/>
+          <w:bCs/>
+          <w:lang w:val="fr-FR"/>
+        </w:rPr>
+        <w:t xml:space="preserve">. Plutôt que d’attendre d’avoir toutes les composantes d’un exercice fiscal complet, il est méthodologiquement plus pertinent de commencer par le bloc le plus observable et le plus robuste : la consommation finale des ménages. </w:t>
+      </w:r>
+      <w:r>
+        <w:rPr>
+          <w:rFonts w:ascii="Arial" w:hAnsi="Arial" w:cs="Arial"/>
+          <w:lang w:val="fr-FR"/>
+        </w:rPr>
+        <w:t xml:space="preserve">Cette stratégie présente plusieurs avantages. D’abord, elle exploite un volet de l’enquête généralement mieux mesuré que le revenu courant. Ensuite, elle permet d’entrer rapidement dans une logique de microsimulation à partir d’unités observées. </w:t>
+      </w:r>
+      <w:r>
+        <w:rPr>
+          <w:rFonts w:ascii="Arial" w:hAnsi="Arial" w:cs="Arial"/>
+          <w:b/>
+          <w:bCs/>
+          <w:lang w:val="fr-FR"/>
+        </w:rPr>
+        <w:t>Enfin, elle constitue une base solide pour des extensions ultérieures vers une évaluation plus complète intégrant la fiscalité directe, les transferts monétaires et les transferts en nature.</w:t>
+      </w:r>
+    </w:p>
+    <w:p>
+      <w:pPr>
+        <w:pStyle w:val="BodyText"/>
+        <w:jc w:val="both"/>
+        <w:rPr>
+          <w:rFonts w:ascii="Arial" w:hAnsi="Arial" w:cs="Arial"/>
+          <w:lang w:val="fr-FR"/>
+        </w:rPr>
+      </w:pPr>
+      <w:r>
+        <w:rPr>
+          <w:rFonts w:ascii="Arial" w:hAnsi="Arial" w:cs="Arial"/>
+          <w:lang w:val="fr-FR"/>
+        </w:rPr>
+        <w:t xml:space="preserve">Autrement dit, le projet ne doit pas être présenté comme une version incomplète d’une étude idéale, mais comme une première étape de recherche délibérément ciblée sur une question précisément identifiable : </w:t>
+      </w:r>
+      <w:r>
+        <w:rPr>
+          <w:rFonts w:ascii="Arial" w:hAnsi="Arial" w:cs="Arial"/>
+          <w:b/>
+          <w:bCs/>
+          <w:lang w:val="fr-FR"/>
+        </w:rPr>
+        <w:t xml:space="preserve">comment les taxes indirectes s’imputent-elles </w:t>
+      </w:r>
+      <w:r>
+        <w:rPr>
+          <w:rFonts w:ascii="Arial" w:hAnsi="Arial" w:cs="Arial"/>
+          <w:b/>
+          <w:bCs/>
+          <w:lang w:val="fr-FR"/>
+        </w:rPr>
         <w:lastRenderedPageBreak/>
         <w:t>sur les ménages ivoiriens compte tenu de leur structure de consommation observée ?</w:t>
       </w:r>
     </w:p>
     <w:p>
       <w:pPr>
-        <w:rPr>
-          <w:rFonts w:ascii="Arial" w:hAnsi="Arial" w:cs="Arial"/>
-        </w:rPr>
-      </w:pPr>
-      <w:r>
-        <w:rPr>
-          <w:rFonts w:ascii="Arial" w:hAnsi="Arial" w:cs="Arial"/>
-        </w:rPr>
-        <w:pict w14:anchorId="458B317D">
-          <v:rect id="_x0000_i1028" style="width:0;height:1.5pt" o:hralign="center" o:hrstd="t" o:hr="t"/>
-        </w:pict>
-      </w:r>
-    </w:p>
-    <w:p>
-      <w:pPr>
-        <w:pStyle w:val="Heading2"/>
-        <w:rPr>
-          <w:rFonts w:ascii="Arial" w:hAnsi="Arial" w:cs="Arial"/>
+        <w:pStyle w:val="Title"/>
+        <w:numPr>
+          <w:ilvl w:val="0"/>
+          <w:numId w:val="36"/>
+        </w:numPr>
+        <w:jc w:val="left"/>
+        <w:rPr>
           <w:lang w:val="fr-FR"/>
         </w:rPr>
       </w:pPr>
@@ -435,10 +509,9 @@
       <w:bookmarkEnd w:id="5"/>
       <w:r>
         <w:rPr>
-          <w:rFonts w:ascii="Arial" w:hAnsi="Arial" w:cs="Arial"/>
-          <w:lang w:val="fr-FR"/>
-        </w:rPr>
-        <w:t>4. Question de recherche</w:t>
+          <w:lang w:val="fr-FR"/>
+        </w:rPr>
+        <w:t>Question de recherche</w:t>
       </w:r>
     </w:p>
     <w:p>
@@ -460,6 +533,7 @@
     <w:p>
       <w:pPr>
         <w:pStyle w:val="BodyText"/>
+        <w:jc w:val="both"/>
         <w:rPr>
           <w:rFonts w:ascii="Arial" w:hAnsi="Arial" w:cs="Arial"/>
           <w:lang w:val="fr-FR"/>
@@ -472,7 +546,25 @@
           <w:bCs/>
           <w:lang w:val="fr-FR"/>
         </w:rPr>
-        <w:t>Quelle est l’incidence distributive des taxes indirectes supportées par les ménages en Côte d’Ivoire, telle qu’on peut l’estimer à partir de la structure de consommation observée dans l’EHCVM 2018 ?</w:t>
+        <w:t>Quelle est l’incidence distributive des taxes indirectes supportées par les ménages en Côte d’Ivoire, telle qu’on peut l’estimer à partir de la structure de consommation observée dans l’EHCVM 20</w:t>
+      </w:r>
+      <w:r>
+        <w:rPr>
+          <w:rFonts w:ascii="Arial" w:hAnsi="Arial" w:cs="Arial"/>
+          <w:b/>
+          <w:bCs/>
+          <w:lang w:val="fr-FR"/>
+        </w:rPr>
+        <w:t>21</w:t>
+      </w:r>
+      <w:r>
+        <w:rPr>
+          <w:rFonts w:ascii="Arial" w:hAnsi="Arial" w:cs="Arial"/>
+          <w:b/>
+          <w:bCs/>
+          <w:lang w:val="fr-FR"/>
+        </w:rPr>
+        <w:t xml:space="preserve"> ?</w:t>
       </w:r>
     </w:p>
     <w:p>
@@ -496,16 +588,19 @@
         <w:pStyle w:val="Compact"/>
         <w:numPr>
           <w:ilvl w:val="0"/>
-          <w:numId w:val="2"/>
-        </w:numPr>
-        <w:rPr>
-          <w:rFonts w:ascii="Arial" w:hAnsi="Arial" w:cs="Arial"/>
-          <w:lang w:val="fr-FR"/>
-        </w:rPr>
-      </w:pPr>
-      <w:r>
-        <w:rPr>
-          <w:rFonts w:ascii="Arial" w:hAnsi="Arial" w:cs="Arial"/>
+          <w:numId w:val="37"/>
+        </w:numPr>
+        <w:jc w:val="both"/>
+        <w:rPr>
+          <w:rFonts w:ascii="Arial" w:hAnsi="Arial" w:cs="Arial"/>
+          <w:highlight w:val="yellow"/>
+          <w:lang w:val="fr-FR"/>
+        </w:rPr>
+      </w:pPr>
+      <w:r>
+        <w:rPr>
+          <w:rFonts w:ascii="Arial" w:hAnsi="Arial" w:cs="Arial"/>
+          <w:highlight w:val="yellow"/>
           <w:lang w:val="fr-FR"/>
         </w:rPr>
         <w:t>Quels groupes de ménages supportent la plus grande part des taxes indirectes en niveau absolu ?</w:t>
@@ -516,8 +611,9 @@
         <w:pStyle w:val="Compact"/>
         <w:numPr>
           <w:ilvl w:val="0"/>
-          <w:numId w:val="2"/>
-        </w:numPr>
+          <w:numId w:val="37"/>
+        </w:numPr>
+        <w:jc w:val="both"/>
         <w:rPr>
           <w:rFonts w:ascii="Arial" w:hAnsi="Arial" w:cs="Arial"/>
           <w:lang w:val="fr-FR"/>
@@ -536,8 +632,9 @@
         <w:pStyle w:val="Compact"/>
         <w:numPr>
           <w:ilvl w:val="0"/>
-          <w:numId w:val="2"/>
-        </w:numPr>
+          <w:numId w:val="37"/>
+        </w:numPr>
+        <w:jc w:val="both"/>
         <w:rPr>
           <w:rFonts w:ascii="Arial" w:hAnsi="Arial" w:cs="Arial"/>
           <w:lang w:val="fr-FR"/>
@@ -556,8 +653,9 @@
         <w:pStyle w:val="Compact"/>
         <w:numPr>
           <w:ilvl w:val="0"/>
-          <w:numId w:val="2"/>
-        </w:numPr>
+          <w:numId w:val="37"/>
+        </w:numPr>
+        <w:jc w:val="both"/>
         <w:rPr>
           <w:rFonts w:ascii="Arial" w:hAnsi="Arial" w:cs="Arial"/>
           <w:lang w:val="fr-FR"/>
@@ -576,16 +674,19 @@
         <w:pStyle w:val="Compact"/>
         <w:numPr>
           <w:ilvl w:val="0"/>
-          <w:numId w:val="2"/>
-        </w:numPr>
-        <w:rPr>
-          <w:rFonts w:ascii="Arial" w:hAnsi="Arial" w:cs="Arial"/>
-          <w:lang w:val="fr-FR"/>
-        </w:rPr>
-      </w:pPr>
-      <w:r>
-        <w:rPr>
-          <w:rFonts w:ascii="Arial" w:hAnsi="Arial" w:cs="Arial"/>
+          <w:numId w:val="37"/>
+        </w:numPr>
+        <w:jc w:val="both"/>
+        <w:rPr>
+          <w:rFonts w:ascii="Arial" w:hAnsi="Arial" w:cs="Arial"/>
+          <w:highlight w:val="yellow"/>
+          <w:lang w:val="fr-FR"/>
+        </w:rPr>
+      </w:pPr>
+      <w:r>
+        <w:rPr>
+          <w:rFonts w:ascii="Arial" w:hAnsi="Arial" w:cs="Arial"/>
+          <w:highlight w:val="yellow"/>
           <w:lang w:val="fr-FR"/>
         </w:rPr>
         <w:t>Dans quelle mesure les résultats dépendent-ils des hypothèses faites sur les exonérations, l’informalité, le mode d’acquisition des biens et le choix entre taux statutaires et taux effectifs ?</w:t>
@@ -597,20 +698,16 @@
           <w:rFonts w:ascii="Arial" w:hAnsi="Arial" w:cs="Arial"/>
         </w:rPr>
       </w:pPr>
-      <w:r>
-        <w:rPr>
-          <w:rFonts w:ascii="Arial" w:hAnsi="Arial" w:cs="Arial"/>
-        </w:rPr>
-        <w:pict w14:anchorId="07F66B8B">
-          <v:rect id="_x0000_i1029" style="width:0;height:1.5pt" o:hralign="center" o:hrstd="t" o:hr="t"/>
-        </w:pict>
-      </w:r>
-    </w:p>
-    <w:p>
-      <w:pPr>
-        <w:pStyle w:val="Heading2"/>
-        <w:rPr>
-          <w:rFonts w:ascii="Arial" w:hAnsi="Arial" w:cs="Arial"/>
+    </w:p>
+    <w:p>
+      <w:pPr>
+        <w:pStyle w:val="Title"/>
+        <w:numPr>
+          <w:ilvl w:val="0"/>
+          <w:numId w:val="36"/>
+        </w:numPr>
+        <w:jc w:val="left"/>
+        <w:rPr>
           <w:lang w:val="fr-FR"/>
         </w:rPr>
       </w:pPr>
@@ -618,43 +715,56 @@
       <w:bookmarkEnd w:id="6"/>
       <w:r>
         <w:rPr>
-          <w:rFonts w:ascii="Arial" w:hAnsi="Arial" w:cs="Arial"/>
-          <w:lang w:val="fr-FR"/>
-        </w:rPr>
-        <w:t>5. Objectifs de l’étude</w:t>
-      </w:r>
-    </w:p>
-    <w:p>
-      <w:pPr>
-        <w:pStyle w:val="Heading3"/>
-        <w:rPr>
-          <w:rFonts w:ascii="Arial" w:hAnsi="Arial" w:cs="Arial"/>
+          <w:lang w:val="fr-FR"/>
+        </w:rPr>
+        <w:t>Objectifs de l’étude</w:t>
+      </w:r>
+    </w:p>
+    <w:p>
+      <w:pPr>
+        <w:pStyle w:val="Title"/>
+        <w:jc w:val="left"/>
+        <w:rPr>
           <w:lang w:val="fr-FR"/>
         </w:rPr>
       </w:pPr>
       <w:bookmarkStart w:id="8" w:name="objectif-général"/>
       <w:r>
         <w:rPr>
-          <w:rFonts w:ascii="Arial" w:hAnsi="Arial" w:cs="Arial"/>
-          <w:lang w:val="fr-FR"/>
-        </w:rPr>
-        <w:t>5.1 Objectif général</w:t>
+          <w:lang w:val="fr-FR"/>
+        </w:rPr>
+        <w:t>Objectif général</w:t>
       </w:r>
     </w:p>
     <w:p>
       <w:pPr>
         <w:pStyle w:val="FirstParagraph"/>
-        <w:rPr>
-          <w:rFonts w:ascii="Arial" w:hAnsi="Arial" w:cs="Arial"/>
-          <w:lang w:val="fr-FR"/>
-        </w:rPr>
-      </w:pPr>
-      <w:r>
-        <w:rPr>
-          <w:rFonts w:ascii="Arial" w:hAnsi="Arial" w:cs="Arial"/>
-          <w:lang w:val="fr-FR"/>
-        </w:rPr>
-        <w:t>Adapter l’approche d’incidence fiscale de type CEQ au contexte ivoirien en exploitant les données EHCVM 2018 disponibles, afin d’estimer la charge distributive des taxes indirectes pesant sur les ménages.</w:t>
+        <w:jc w:val="both"/>
+        <w:rPr>
+          <w:rFonts w:ascii="Arial" w:hAnsi="Arial" w:cs="Arial"/>
+          <w:lang w:val="fr-FR"/>
+        </w:rPr>
+      </w:pPr>
+      <w:r>
+        <w:rPr>
+          <w:rFonts w:ascii="Arial" w:hAnsi="Arial" w:cs="Arial"/>
+          <w:lang w:val="fr-FR"/>
+        </w:rPr>
+        <w:t>Adapter l’approche d’incidence fiscale de type CEQ au contexte ivoirien en exploitant les données EHCVM 20</w:t>
+      </w:r>
+      <w:r>
+        <w:rPr>
+          <w:rFonts w:ascii="Arial" w:hAnsi="Arial" w:cs="Arial"/>
+          <w:lang w:val="fr-FR"/>
+        </w:rPr>
+        <w:t>21</w:t>
+      </w:r>
+      <w:r>
+        <w:rPr>
+          <w:rFonts w:ascii="Arial" w:hAnsi="Arial" w:cs="Arial"/>
+          <w:lang w:val="fr-FR"/>
+        </w:rPr>
+        <w:t xml:space="preserve"> disponibles, afin d’estimer la charge distributive des taxes indirectes pesant sur les ménages.</w:t>
       </w:r>
     </w:p>
     <w:p>
@@ -670,30 +780,8 @@
         <w:rPr>
           <w:rFonts w:ascii="Arial" w:hAnsi="Arial" w:cs="Arial"/>
         </w:rPr>
-        <w:t xml:space="preserve">5.2 </w:t>
-      </w:r>
-      <w:proofErr w:type="spellStart"/>
-      <w:r>
-        <w:rPr>
-          <w:rFonts w:ascii="Arial" w:hAnsi="Arial" w:cs="Arial"/>
-        </w:rPr>
-        <w:t>Objectifs</w:t>
-      </w:r>
-      <w:proofErr w:type="spellEnd"/>
-      <w:r>
-        <w:rPr>
-          <w:rFonts w:ascii="Arial" w:hAnsi="Arial" w:cs="Arial"/>
-        </w:rPr>
-        <w:t xml:space="preserve"> </w:t>
-      </w:r>
-      <w:proofErr w:type="spellStart"/>
-      <w:r>
-        <w:rPr>
-          <w:rFonts w:ascii="Arial" w:hAnsi="Arial" w:cs="Arial"/>
-        </w:rPr>
-        <w:t>spécifiques</w:t>
-      </w:r>
-      <w:proofErr w:type="spellEnd"/>
+        <w:t>5.2 Objectifs spécifiques</w:t>
+      </w:r>
     </w:p>
     <w:p>
       <w:pPr>
@@ -702,14 +790,17 @@
           <w:ilvl w:val="0"/>
           <w:numId w:val="3"/>
         </w:numPr>
-        <w:rPr>
-          <w:rFonts w:ascii="Arial" w:hAnsi="Arial" w:cs="Arial"/>
-          <w:lang w:val="fr-FR"/>
-        </w:rPr>
-      </w:pPr>
-      <w:r>
-        <w:rPr>
-          <w:rFonts w:ascii="Arial" w:hAnsi="Arial" w:cs="Arial"/>
+        <w:jc w:val="both"/>
+        <w:rPr>
+          <w:rFonts w:ascii="Arial" w:hAnsi="Arial" w:cs="Arial"/>
+          <w:highlight w:val="yellow"/>
+          <w:lang w:val="fr-FR"/>
+        </w:rPr>
+      </w:pPr>
+      <w:r>
+        <w:rPr>
+          <w:rFonts w:ascii="Arial" w:hAnsi="Arial" w:cs="Arial"/>
+          <w:highlight w:val="yellow"/>
           <w:lang w:val="fr-FR"/>
         </w:rPr>
         <w:t>Construire une base ménage de consommation totale et de consommation par catégories de produits à partir du fichier détaillé de dépenses.</w:t>
@@ -722,6 +813,7 @@
           <w:ilvl w:val="0"/>
           <w:numId w:val="3"/>
         </w:numPr>
+        <w:jc w:val="both"/>
         <w:rPr>
           <w:rFonts w:ascii="Arial" w:hAnsi="Arial" w:cs="Arial"/>
           <w:lang w:val="fr-FR"/>
@@ -742,6 +834,7 @@
           <w:ilvl w:val="0"/>
           <w:numId w:val="3"/>
         </w:numPr>
+        <w:jc w:val="both"/>
         <w:rPr>
           <w:rFonts w:ascii="Arial" w:hAnsi="Arial" w:cs="Arial"/>
           <w:lang w:val="fr-FR"/>
@@ -762,6 +855,7 @@
           <w:ilvl w:val="0"/>
           <w:numId w:val="3"/>
         </w:numPr>
+        <w:jc w:val="both"/>
         <w:rPr>
           <w:rFonts w:ascii="Arial" w:hAnsi="Arial" w:cs="Arial"/>
           <w:lang w:val="fr-FR"/>
@@ -782,6 +876,7 @@
           <w:ilvl w:val="0"/>
           <w:numId w:val="3"/>
         </w:numPr>
+        <w:jc w:val="both"/>
         <w:rPr>
           <w:rFonts w:ascii="Arial" w:hAnsi="Arial" w:cs="Arial"/>
           <w:lang w:val="fr-FR"/>
@@ -803,6 +898,7 @@
           <w:ilvl w:val="0"/>
           <w:numId w:val="3"/>
         </w:numPr>
+        <w:jc w:val="both"/>
         <w:rPr>
           <w:rFonts w:ascii="Arial" w:hAnsi="Arial" w:cs="Arial"/>
           <w:lang w:val="fr-FR"/>
@@ -822,14 +918,6 @@
           <w:rFonts w:ascii="Arial" w:hAnsi="Arial" w:cs="Arial"/>
         </w:rPr>
       </w:pPr>
-      <w:r>
-        <w:rPr>
-          <w:rFonts w:ascii="Arial" w:hAnsi="Arial" w:cs="Arial"/>
-        </w:rPr>
-        <w:pict w14:anchorId="138872E3">
-          <v:rect id="_x0000_i1030" style="width:0;height:1.5pt" o:hralign="center" o:hrstd="t" o:hr="t"/>
-        </w:pict>
-      </w:r>
     </w:p>
     <w:p>
       <w:pPr>
@@ -853,6 +941,7 @@
     <w:p>
       <w:pPr>
         <w:pStyle w:val="FirstParagraph"/>
+        <w:jc w:val="both"/>
         <w:rPr>
           <w:rFonts w:ascii="Arial" w:hAnsi="Arial" w:cs="Arial"/>
           <w:lang w:val="fr-FR"/>
@@ -889,6 +978,7 @@
           <w:ilvl w:val="0"/>
           <w:numId w:val="4"/>
         </w:numPr>
+        <w:jc w:val="both"/>
         <w:rPr>
           <w:rFonts w:ascii="Arial" w:hAnsi="Arial" w:cs="Arial"/>
           <w:lang w:val="fr-FR"/>
@@ -918,6 +1008,7 @@
           <w:ilvl w:val="0"/>
           <w:numId w:val="4"/>
         </w:numPr>
+        <w:jc w:val="both"/>
         <w:rPr>
           <w:rFonts w:ascii="Arial" w:hAnsi="Arial" w:cs="Arial"/>
           <w:lang w:val="fr-FR"/>
@@ -947,6 +1038,7 @@
           <w:ilvl w:val="0"/>
           <w:numId w:val="4"/>
         </w:numPr>
+        <w:jc w:val="both"/>
         <w:rPr>
           <w:rFonts w:ascii="Arial" w:hAnsi="Arial" w:cs="Arial"/>
           <w:lang w:val="fr-FR"/>
@@ -976,6 +1068,7 @@
           <w:ilvl w:val="0"/>
           <w:numId w:val="4"/>
         </w:numPr>
+        <w:jc w:val="both"/>
         <w:rPr>
           <w:rFonts w:ascii="Arial" w:hAnsi="Arial" w:cs="Arial"/>
           <w:lang w:val="fr-FR"/>
@@ -1194,7 +1287,7 @@
           <w:rFonts w:ascii="Arial" w:hAnsi="Arial" w:cs="Arial"/>
         </w:rPr>
         <w:pict w14:anchorId="74AC3B90">
-          <v:rect id="_x0000_i1031" style="width:0;height:1.5pt" o:hralign="center" o:hrstd="t" o:hr="t"/>
+          <v:rect id="_x0000_i1029" style="width:0;height:1.5pt" o:hralign="center" o:hrstd="t" o:hr="t"/>
         </w:pict>
       </w:r>
     </w:p>
@@ -1642,7 +1735,7 @@
           <w:rFonts w:ascii="Arial" w:hAnsi="Arial" w:cs="Arial"/>
         </w:rPr>
         <w:pict w14:anchorId="0E75FFFF">
-          <v:rect id="_x0000_i1032" style="width:0;height:1.5pt" o:hralign="center" o:hrstd="t" o:hr="t"/>
+          <v:rect id="_x0000_i1030" style="width:0;height:1.5pt" o:hralign="center" o:hrstd="t" o:hr="t"/>
         </w:pict>
       </w:r>
     </w:p>
@@ -2093,7 +2186,7 @@
           <w:rFonts w:ascii="Arial" w:hAnsi="Arial" w:cs="Arial"/>
         </w:rPr>
         <w:pict w14:anchorId="5FEA96B4">
-          <v:rect id="_x0000_i1033" style="width:0;height:1.5pt" o:hralign="center" o:hrstd="t" o:hr="t"/>
+          <v:rect id="_x0000_i1031" style="width:0;height:1.5pt" o:hralign="center" o:hrstd="t" o:hr="t"/>
         </w:pict>
       </w:r>
     </w:p>
@@ -2476,7 +2569,7 @@
           <w:rFonts w:ascii="Arial" w:hAnsi="Arial" w:cs="Arial"/>
         </w:rPr>
         <w:pict w14:anchorId="45A452A7">
-          <v:rect id="_x0000_i1034" style="width:0;height:1.5pt" o:hralign="center" o:hrstd="t" o:hr="t"/>
+          <v:rect id="_x0000_i1032" style="width:0;height:1.5pt" o:hralign="center" o:hrstd="t" o:hr="t"/>
         </w:pict>
       </w:r>
     </w:p>
@@ -2675,7 +2768,7 @@
           <w:rFonts w:ascii="Arial" w:hAnsi="Arial" w:cs="Arial"/>
         </w:rPr>
         <w:pict w14:anchorId="4C03B3A6">
-          <v:rect id="_x0000_i1035" style="width:0;height:1.5pt" o:hralign="center" o:hrstd="t" o:hr="t"/>
+          <v:rect id="_x0000_i1033" style="width:0;height:1.5pt" o:hralign="center" o:hrstd="t" o:hr="t"/>
         </w:pict>
       </w:r>
     </w:p>
@@ -3014,7 +3107,7 @@
           <w:rFonts w:ascii="Arial" w:hAnsi="Arial" w:cs="Arial"/>
         </w:rPr>
         <w:pict w14:anchorId="450FBF1F">
-          <v:rect id="_x0000_i1036" style="width:0;height:1.5pt" o:hralign="center" o:hrstd="t" o:hr="t"/>
+          <v:rect id="_x0000_i1034" style="width:0;height:1.5pt" o:hralign="center" o:hrstd="t" o:hr="t"/>
         </w:pict>
       </w:r>
     </w:p>
@@ -3659,7 +3752,7 @@
           <w:rFonts w:ascii="Arial" w:hAnsi="Arial" w:cs="Arial"/>
         </w:rPr>
         <w:pict w14:anchorId="0823DD9C">
-          <v:rect id="_x0000_i1037" style="width:0;height:1.5pt" o:hralign="center" o:hrstd="t" o:hr="t"/>
+          <v:rect id="_x0000_i1035" style="width:0;height:1.5pt" o:hralign="center" o:hrstd="t" o:hr="t"/>
         </w:pict>
       </w:r>
     </w:p>
@@ -3895,7 +3988,7 @@
           <w:rFonts w:ascii="Arial" w:hAnsi="Arial" w:cs="Arial"/>
         </w:rPr>
         <w:pict w14:anchorId="62F958E0">
-          <v:rect id="_x0000_i1038" style="width:0;height:1.5pt" o:hralign="center" o:hrstd="t" o:hr="t"/>
+          <v:rect id="_x0000_i1036" style="width:0;height:1.5pt" o:hralign="center" o:hrstd="t" o:hr="t"/>
         </w:pict>
       </w:r>
     </w:p>
@@ -4202,7 +4295,7 @@
           <w:rFonts w:ascii="Arial" w:hAnsi="Arial" w:cs="Arial"/>
         </w:rPr>
         <w:pict w14:anchorId="12D373DA">
-          <v:rect id="_x0000_i1039" style="width:0;height:1.5pt" o:hralign="center" o:hrstd="t" o:hr="t"/>
+          <v:rect id="_x0000_i1037" style="width:0;height:1.5pt" o:hralign="center" o:hrstd="t" o:hr="t"/>
         </w:pict>
       </w:r>
     </w:p>
@@ -4595,7 +4688,7 @@
           <w:rFonts w:ascii="Arial" w:hAnsi="Arial" w:cs="Arial"/>
         </w:rPr>
         <w:pict w14:anchorId="551029F1">
-          <v:rect id="_x0000_i1040" style="width:0;height:1.5pt" o:hralign="center" o:hrstd="t" o:hr="t"/>
+          <v:rect id="_x0000_i1038" style="width:0;height:1.5pt" o:hralign="center" o:hrstd="t" o:hr="t"/>
         </w:pict>
       </w:r>
     </w:p>
@@ -5802,7 +5895,7 @@
           <w:rFonts w:ascii="Arial" w:hAnsi="Arial" w:cs="Arial"/>
         </w:rPr>
         <w:pict w14:anchorId="6825E1C8">
-          <v:rect id="_x0000_i1041" style="width:0;height:1.5pt" o:hralign="center" o:hrstd="t" o:hr="t"/>
+          <v:rect id="_x0000_i1039" style="width:0;height:1.5pt" o:hralign="center" o:hrstd="t" o:hr="t"/>
         </w:pict>
       </w:r>
     </w:p>
@@ -5900,7 +5993,7 @@
           <w:rFonts w:ascii="Arial" w:hAnsi="Arial" w:cs="Arial"/>
         </w:rPr>
         <w:pict w14:anchorId="1053B0B1">
-          <v:rect id="_x0000_i1042" style="width:0;height:1.5pt" o:hralign="center" o:hrstd="t" o:hr="t"/>
+          <v:rect id="_x0000_i1040" style="width:0;height:1.5pt" o:hralign="center" o:hrstd="t" o:hr="t"/>
         </w:pict>
       </w:r>
     </w:p>
@@ -6171,7 +6264,7 @@
           <w:rFonts w:ascii="Arial" w:hAnsi="Arial" w:cs="Arial"/>
         </w:rPr>
         <w:pict w14:anchorId="75AE3384">
-          <v:rect id="_x0000_i1043" style="width:0;height:1.5pt" o:hralign="center" o:hrstd="t" o:hr="t"/>
+          <v:rect id="_x0000_i1041" style="width:0;height:1.5pt" o:hralign="center" o:hrstd="t" o:hr="t"/>
         </w:pict>
       </w:r>
     </w:p>
@@ -6269,7 +6362,7 @@
           <w:rFonts w:ascii="Arial" w:hAnsi="Arial" w:cs="Arial"/>
         </w:rPr>
         <w:pict w14:anchorId="36FB3827">
-          <v:rect id="_x0000_i1044" style="width:0;height:1.5pt" o:hralign="center" o:hrstd="t" o:hr="t"/>
+          <v:rect id="_x0000_i1042" style="width:0;height:1.5pt" o:hralign="center" o:hrstd="t" o:hr="t"/>
         </w:pict>
       </w:r>
     </w:p>
@@ -6538,7 +6631,7 @@
           <w:rFonts w:ascii="Arial" w:hAnsi="Arial" w:cs="Arial"/>
         </w:rPr>
         <w:pict w14:anchorId="5EA60AE8">
-          <v:rect id="_x0000_i1045" style="width:0;height:1.5pt" o:hralign="center" o:hrstd="t" o:hr="t"/>
+          <v:rect id="_x0000_i1043" style="width:0;height:1.5pt" o:hralign="center" o:hrstd="t" o:hr="t"/>
         </w:pict>
       </w:r>
     </w:p>
@@ -6915,7 +7008,7 @@
           <w:rFonts w:ascii="Arial" w:hAnsi="Arial" w:cs="Arial"/>
         </w:rPr>
         <w:pict w14:anchorId="22FD3ED9">
-          <v:rect id="_x0000_i1046" style="width:0;height:1.5pt" o:hralign="center" o:hrstd="t" o:hr="t"/>
+          <v:rect id="_x0000_i1044" style="width:0;height:1.5pt" o:hralign="center" o:hrstd="t" o:hr="t"/>
         </w:pict>
       </w:r>
     </w:p>
@@ -7168,7 +7261,7 @@
           <w:rFonts w:ascii="Arial" w:hAnsi="Arial" w:cs="Arial"/>
         </w:rPr>
         <w:pict w14:anchorId="6860D921">
-          <v:rect id="_x0000_i1047" style="width:0;height:1.5pt" o:hralign="center" o:hrstd="t" o:hr="t"/>
+          <v:rect id="_x0000_i1045" style="width:0;height:1.5pt" o:hralign="center" o:hrstd="t" o:hr="t"/>
         </w:pict>
       </w:r>
     </w:p>
@@ -7921,7 +8014,7 @@
           <w:rFonts w:ascii="Arial" w:hAnsi="Arial" w:cs="Arial"/>
         </w:rPr>
         <w:pict w14:anchorId="6676C012">
-          <v:rect id="_x0000_i1048" style="width:0;height:1.5pt" o:hralign="center" o:hrstd="t" o:hr="t"/>
+          <v:rect id="_x0000_i1046" style="width:0;height:1.5pt" o:hralign="center" o:hrstd="t" o:hr="t"/>
         </w:pict>
       </w:r>
     </w:p>
@@ -8019,6 +8112,433 @@
           <w:rFonts w:ascii="Arial" w:hAnsi="Arial" w:cs="Arial"/>
         </w:rPr>
         <w:pict w14:anchorId="74B360C1">
+          <v:rect id="_x0000_i1047" style="width:0;height:1.5pt" o:hralign="center" o:hrstd="t" o:hr="t"/>
+        </w:pict>
+      </w:r>
+    </w:p>
+    <w:p>
+      <w:pPr>
+        <w:pStyle w:val="Heading2"/>
+        <w:rPr>
+          <w:rFonts w:ascii="Arial" w:hAnsi="Arial" w:cs="Arial"/>
+          <w:lang w:val="fr-FR"/>
+        </w:rPr>
+      </w:pPr>
+      <w:bookmarkStart w:id="91" w:name="X93c83c51b3390530649c130afe196a87331a6ed"/>
+      <w:bookmarkEnd w:id="90"/>
+      <w:r>
+        <w:rPr>
+          <w:rFonts w:ascii="Arial" w:hAnsi="Arial" w:cs="Arial"/>
+          <w:lang w:val="fr-FR"/>
+        </w:rPr>
+        <w:t>25. Positionnement prudent des conclusions futures</w:t>
+      </w:r>
+    </w:p>
+    <w:p>
+      <w:pPr>
+        <w:pStyle w:val="FirstParagraph"/>
+        <w:rPr>
+          <w:rFonts w:ascii="Arial" w:hAnsi="Arial" w:cs="Arial"/>
+          <w:lang w:val="fr-FR"/>
+        </w:rPr>
+      </w:pPr>
+      <w:r>
+        <w:rPr>
+          <w:rFonts w:ascii="Arial" w:hAnsi="Arial" w:cs="Arial"/>
+          <w:lang w:val="fr-FR"/>
+        </w:rPr>
+        <w:t>Les résultats qui sortiront de cette première phase devront être présentés avec la prudence suivante :</w:t>
+      </w:r>
+    </w:p>
+    <w:p>
+      <w:pPr>
+        <w:pStyle w:val="Compact"/>
+        <w:numPr>
+          <w:ilvl w:val="0"/>
+          <w:numId w:val="31"/>
+        </w:numPr>
+        <w:rPr>
+          <w:rFonts w:ascii="Arial" w:hAnsi="Arial" w:cs="Arial"/>
+          <w:lang w:val="fr-FR"/>
+        </w:rPr>
+      </w:pPr>
+      <w:proofErr w:type="gramStart"/>
+      <w:r>
+        <w:rPr>
+          <w:rFonts w:ascii="Arial" w:hAnsi="Arial" w:cs="Arial"/>
+          <w:lang w:val="fr-FR"/>
+        </w:rPr>
+        <w:t>ils</w:t>
+      </w:r>
+      <w:proofErr w:type="gramEnd"/>
+      <w:r>
+        <w:rPr>
+          <w:rFonts w:ascii="Arial" w:hAnsi="Arial" w:cs="Arial"/>
+          <w:lang w:val="fr-FR"/>
+        </w:rPr>
+        <w:t xml:space="preserve"> décrivent une incidence simulée de premier ordre ;</w:t>
+      </w:r>
+    </w:p>
+    <w:p>
+      <w:pPr>
+        <w:pStyle w:val="Compact"/>
+        <w:numPr>
+          <w:ilvl w:val="0"/>
+          <w:numId w:val="31"/>
+        </w:numPr>
+        <w:rPr>
+          <w:rFonts w:ascii="Arial" w:hAnsi="Arial" w:cs="Arial"/>
+          <w:lang w:val="fr-FR"/>
+        </w:rPr>
+      </w:pPr>
+      <w:proofErr w:type="gramStart"/>
+      <w:r>
+        <w:rPr>
+          <w:rFonts w:ascii="Arial" w:hAnsi="Arial" w:cs="Arial"/>
+          <w:lang w:val="fr-FR"/>
+        </w:rPr>
+        <w:t>ils</w:t>
+      </w:r>
+      <w:proofErr w:type="gramEnd"/>
+      <w:r>
+        <w:rPr>
+          <w:rFonts w:ascii="Arial" w:hAnsi="Arial" w:cs="Arial"/>
+          <w:lang w:val="fr-FR"/>
+        </w:rPr>
+        <w:t xml:space="preserve"> ne représentent pas encore l’incidence fiscale totale du système ;</w:t>
+      </w:r>
+    </w:p>
+    <w:p>
+      <w:pPr>
+        <w:pStyle w:val="Compact"/>
+        <w:numPr>
+          <w:ilvl w:val="0"/>
+          <w:numId w:val="31"/>
+        </w:numPr>
+        <w:rPr>
+          <w:rFonts w:ascii="Arial" w:hAnsi="Arial" w:cs="Arial"/>
+          <w:lang w:val="fr-FR"/>
+        </w:rPr>
+      </w:pPr>
+      <w:proofErr w:type="gramStart"/>
+      <w:r>
+        <w:rPr>
+          <w:rFonts w:ascii="Arial" w:hAnsi="Arial" w:cs="Arial"/>
+          <w:lang w:val="fr-FR"/>
+        </w:rPr>
+        <w:lastRenderedPageBreak/>
+        <w:t>ils</w:t>
+      </w:r>
+      <w:proofErr w:type="gramEnd"/>
+      <w:r>
+        <w:rPr>
+          <w:rFonts w:ascii="Arial" w:hAnsi="Arial" w:cs="Arial"/>
+          <w:lang w:val="fr-FR"/>
+        </w:rPr>
+        <w:t xml:space="preserve"> dépendent d’hypothèses explicites sur le traitement fiscal des produits et sur la répercussion dans les prix ;</w:t>
+      </w:r>
+    </w:p>
+    <w:p>
+      <w:pPr>
+        <w:pStyle w:val="Compact"/>
+        <w:numPr>
+          <w:ilvl w:val="0"/>
+          <w:numId w:val="31"/>
+        </w:numPr>
+        <w:rPr>
+          <w:rFonts w:ascii="Arial" w:hAnsi="Arial" w:cs="Arial"/>
+          <w:lang w:val="fr-FR"/>
+        </w:rPr>
+      </w:pPr>
+      <w:proofErr w:type="gramStart"/>
+      <w:r>
+        <w:rPr>
+          <w:rFonts w:ascii="Arial" w:hAnsi="Arial" w:cs="Arial"/>
+          <w:lang w:val="fr-FR"/>
+        </w:rPr>
+        <w:t>ils</w:t>
+      </w:r>
+      <w:proofErr w:type="gramEnd"/>
+      <w:r>
+        <w:rPr>
+          <w:rFonts w:ascii="Arial" w:hAnsi="Arial" w:cs="Arial"/>
+          <w:lang w:val="fr-FR"/>
+        </w:rPr>
+        <w:t xml:space="preserve"> sont néanmoins très informatifs pour documenter les profils distributifs de la taxation de la consommation.</w:t>
+      </w:r>
+    </w:p>
+    <w:p>
+      <w:pPr>
+        <w:pStyle w:val="FirstParagraph"/>
+        <w:rPr>
+          <w:rFonts w:ascii="Arial" w:hAnsi="Arial" w:cs="Arial"/>
+          <w:lang w:val="fr-FR"/>
+        </w:rPr>
+      </w:pPr>
+      <w:r>
+        <w:rPr>
+          <w:rFonts w:ascii="Arial" w:hAnsi="Arial" w:cs="Arial"/>
+          <w:lang w:val="fr-FR"/>
+        </w:rPr>
+        <w:t>Cette prudence renforcera la crédibilité du travail plutôt que de l’affaiblir.</w:t>
+      </w:r>
+    </w:p>
+    <w:p>
+      <w:pPr>
+        <w:rPr>
+          <w:rFonts w:ascii="Arial" w:hAnsi="Arial" w:cs="Arial"/>
+        </w:rPr>
+      </w:pPr>
+      <w:r>
+        <w:rPr>
+          <w:rFonts w:ascii="Arial" w:hAnsi="Arial" w:cs="Arial"/>
+        </w:rPr>
+        <w:pict w14:anchorId="2093D3BC">
+          <v:rect id="_x0000_i1048" style="width:0;height:1.5pt" o:hralign="center" o:hrstd="t" o:hr="t"/>
+        </w:pict>
+      </w:r>
+    </w:p>
+    <w:p>
+      <w:pPr>
+        <w:pStyle w:val="Heading2"/>
+        <w:rPr>
+          <w:rFonts w:ascii="Arial" w:hAnsi="Arial" w:cs="Arial"/>
+          <w:lang w:val="fr-FR"/>
+        </w:rPr>
+      </w:pPr>
+      <w:bookmarkStart w:id="92" w:name="Xacc971b5ff0e601b5a7b656bafe996703119188"/>
+      <w:bookmarkEnd w:id="91"/>
+      <w:r>
+        <w:rPr>
+          <w:rFonts w:ascii="Arial" w:hAnsi="Arial" w:cs="Arial"/>
+          <w:lang w:val="fr-FR"/>
+        </w:rPr>
+        <w:t>26. Références de base à mobiliser dans la version finale</w:t>
+      </w:r>
+    </w:p>
+    <w:p>
+      <w:pPr>
+        <w:pStyle w:val="Compact"/>
+        <w:numPr>
+          <w:ilvl w:val="0"/>
+          <w:numId w:val="32"/>
+        </w:numPr>
+        <w:rPr>
+          <w:rFonts w:ascii="Arial" w:hAnsi="Arial" w:cs="Arial"/>
+        </w:rPr>
+      </w:pPr>
+      <w:proofErr w:type="spellStart"/>
+      <w:r>
+        <w:rPr>
+          <w:rFonts w:ascii="Arial" w:hAnsi="Arial" w:cs="Arial"/>
+          <w:lang w:val="fr-FR"/>
+        </w:rPr>
+        <w:t>Inchauste</w:t>
+      </w:r>
+      <w:proofErr w:type="spellEnd"/>
+      <w:r>
+        <w:rPr>
+          <w:rFonts w:ascii="Arial" w:hAnsi="Arial" w:cs="Arial"/>
+          <w:lang w:val="fr-FR"/>
+        </w:rPr>
+        <w:t>, G., et Lustig, N. (</w:t>
+      </w:r>
+      <w:proofErr w:type="spellStart"/>
+      <w:r>
+        <w:rPr>
+          <w:rFonts w:ascii="Arial" w:hAnsi="Arial" w:cs="Arial"/>
+          <w:lang w:val="fr-FR"/>
+        </w:rPr>
+        <w:t>eds</w:t>
+      </w:r>
+      <w:proofErr w:type="spellEnd"/>
+      <w:r>
+        <w:rPr>
+          <w:rFonts w:ascii="Arial" w:hAnsi="Arial" w:cs="Arial"/>
+          <w:lang w:val="fr-FR"/>
+        </w:rPr>
+        <w:t xml:space="preserve">.). </w:t>
+      </w:r>
+      <w:r>
+        <w:rPr>
+          <w:rFonts w:ascii="Arial" w:hAnsi="Arial" w:cs="Arial"/>
+          <w:i/>
+          <w:iCs/>
+        </w:rPr>
+        <w:t>The Distributional Impact of Taxes and Transfers: Evidence from Eight Low- and Middle-Income Countries</w:t>
+      </w:r>
+      <w:r>
+        <w:rPr>
+          <w:rFonts w:ascii="Arial" w:hAnsi="Arial" w:cs="Arial"/>
+        </w:rPr>
+        <w:t>.</w:t>
+      </w:r>
+    </w:p>
+    <w:p>
+      <w:pPr>
+        <w:pStyle w:val="Compact"/>
+        <w:numPr>
+          <w:ilvl w:val="0"/>
+          <w:numId w:val="32"/>
+        </w:numPr>
+        <w:rPr>
+          <w:rFonts w:ascii="Arial" w:hAnsi="Arial" w:cs="Arial"/>
+        </w:rPr>
+      </w:pPr>
+      <w:r>
+        <w:rPr>
+          <w:rFonts w:ascii="Arial" w:hAnsi="Arial" w:cs="Arial"/>
+        </w:rPr>
+        <w:t xml:space="preserve">Lustig, N. </w:t>
+      </w:r>
+      <w:r>
+        <w:rPr>
+          <w:rFonts w:ascii="Arial" w:hAnsi="Arial" w:cs="Arial"/>
+          <w:i/>
+          <w:iCs/>
+        </w:rPr>
+        <w:t>Commitment to Equity Handbook: Estimating the Impact of Fiscal Policy on Inequality and Poverty</w:t>
+      </w:r>
+      <w:r>
+        <w:rPr>
+          <w:rFonts w:ascii="Arial" w:hAnsi="Arial" w:cs="Arial"/>
+        </w:rPr>
+        <w:t>.</w:t>
+      </w:r>
+    </w:p>
+    <w:p>
+      <w:pPr>
+        <w:pStyle w:val="Compact"/>
+        <w:numPr>
+          <w:ilvl w:val="0"/>
+          <w:numId w:val="32"/>
+        </w:numPr>
+        <w:rPr>
+          <w:rFonts w:ascii="Arial" w:hAnsi="Arial" w:cs="Arial"/>
+        </w:rPr>
+      </w:pPr>
+      <w:r>
+        <w:rPr>
+          <w:rFonts w:ascii="Arial" w:hAnsi="Arial" w:cs="Arial"/>
+        </w:rPr>
+        <w:t xml:space="preserve">Demery, L. </w:t>
+      </w:r>
+      <w:r>
+        <w:rPr>
+          <w:rFonts w:ascii="Arial" w:hAnsi="Arial" w:cs="Arial"/>
+          <w:i/>
+          <w:iCs/>
+        </w:rPr>
+        <w:t>Benefit Incidence: A Practitioner’s Guide</w:t>
+      </w:r>
+      <w:r>
+        <w:rPr>
+          <w:rFonts w:ascii="Arial" w:hAnsi="Arial" w:cs="Arial"/>
+        </w:rPr>
+        <w:t>.</w:t>
+      </w:r>
+    </w:p>
+    <w:p>
+      <w:pPr>
+        <w:pStyle w:val="Compact"/>
+        <w:numPr>
+          <w:ilvl w:val="0"/>
+          <w:numId w:val="32"/>
+        </w:numPr>
+        <w:rPr>
+          <w:rFonts w:ascii="Arial" w:hAnsi="Arial" w:cs="Arial"/>
+        </w:rPr>
+      </w:pPr>
+      <w:r>
+        <w:rPr>
+          <w:rFonts w:ascii="Arial" w:hAnsi="Arial" w:cs="Arial"/>
+        </w:rPr>
+        <w:t xml:space="preserve">Deaton, A. et Zaidi, S. </w:t>
+      </w:r>
+      <w:r>
+        <w:rPr>
+          <w:rFonts w:ascii="Arial" w:hAnsi="Arial" w:cs="Arial"/>
+          <w:i/>
+          <w:iCs/>
+        </w:rPr>
+        <w:t>Guidelines for Constructing Consumption Aggregates for Welfare Analysis</w:t>
+      </w:r>
+      <w:r>
+        <w:rPr>
+          <w:rFonts w:ascii="Arial" w:hAnsi="Arial" w:cs="Arial"/>
+        </w:rPr>
+        <w:t>.</w:t>
+      </w:r>
+    </w:p>
+    <w:p>
+      <w:pPr>
+        <w:pStyle w:val="Compact"/>
+        <w:numPr>
+          <w:ilvl w:val="0"/>
+          <w:numId w:val="32"/>
+        </w:numPr>
+        <w:rPr>
+          <w:rFonts w:ascii="Arial" w:hAnsi="Arial" w:cs="Arial"/>
+        </w:rPr>
+      </w:pPr>
+      <w:r>
+        <w:rPr>
+          <w:rFonts w:ascii="Arial" w:hAnsi="Arial" w:cs="Arial"/>
+        </w:rPr>
+        <w:t>Documentation officielle de l’EHCVM.</w:t>
+      </w:r>
+    </w:p>
+    <w:p>
+      <w:pPr>
+        <w:pStyle w:val="Compact"/>
+        <w:numPr>
+          <w:ilvl w:val="0"/>
+          <w:numId w:val="32"/>
+        </w:numPr>
+        <w:rPr>
+          <w:rFonts w:ascii="Arial" w:hAnsi="Arial" w:cs="Arial"/>
+          <w:lang w:val="fr-FR"/>
+        </w:rPr>
+      </w:pPr>
+      <w:r>
+        <w:rPr>
+          <w:rFonts w:ascii="Arial" w:hAnsi="Arial" w:cs="Arial"/>
+          <w:lang w:val="fr-FR"/>
+        </w:rPr>
+        <w:t>Code général des impôts de Côte d’Ivoire et textes d’application pertinents.</w:t>
+      </w:r>
+    </w:p>
+    <w:p>
+      <w:pPr>
+        <w:pStyle w:val="Compact"/>
+        <w:numPr>
+          <w:ilvl w:val="0"/>
+          <w:numId w:val="32"/>
+        </w:numPr>
+        <w:rPr>
+          <w:rFonts w:ascii="Arial" w:hAnsi="Arial" w:cs="Arial"/>
+          <w:lang w:val="fr-FR"/>
+        </w:rPr>
+      </w:pPr>
+      <w:r>
+        <w:rPr>
+          <w:rFonts w:ascii="Arial" w:hAnsi="Arial" w:cs="Arial"/>
+          <w:lang w:val="fr-FR"/>
+        </w:rPr>
+        <w:t>Documentation administrative sur les recettes de TVA et d’accises en Côte d’Ivoire.</w:t>
+      </w:r>
+    </w:p>
+    <w:p>
+      <w:pPr>
+        <w:rPr>
+          <w:rFonts w:ascii="Arial" w:hAnsi="Arial" w:cs="Arial"/>
+        </w:rPr>
+      </w:pPr>
+      <w:r>
+        <w:rPr>
+          <w:rFonts w:ascii="Arial" w:hAnsi="Arial" w:cs="Arial"/>
+        </w:rPr>
+        <w:pict w14:anchorId="622EA471">
           <v:rect id="_x0000_i1049" style="width:0;height:1.5pt" o:hralign="center" o:hrstd="t" o:hr="t"/>
         </w:pict>
       </w:r>
@@ -8031,433 +8551,6 @@
           <w:lang w:val="fr-FR"/>
         </w:rPr>
       </w:pPr>
-      <w:bookmarkStart w:id="91" w:name="X93c83c51b3390530649c130afe196a87331a6ed"/>
-      <w:bookmarkEnd w:id="90"/>
-      <w:r>
-        <w:rPr>
-          <w:rFonts w:ascii="Arial" w:hAnsi="Arial" w:cs="Arial"/>
-          <w:lang w:val="fr-FR"/>
-        </w:rPr>
-        <w:t>25. Positionnement prudent des conclusions futures</w:t>
-      </w:r>
-    </w:p>
-    <w:p>
-      <w:pPr>
-        <w:pStyle w:val="FirstParagraph"/>
-        <w:rPr>
-          <w:rFonts w:ascii="Arial" w:hAnsi="Arial" w:cs="Arial"/>
-          <w:lang w:val="fr-FR"/>
-        </w:rPr>
-      </w:pPr>
-      <w:r>
-        <w:rPr>
-          <w:rFonts w:ascii="Arial" w:hAnsi="Arial" w:cs="Arial"/>
-          <w:lang w:val="fr-FR"/>
-        </w:rPr>
-        <w:t>Les résultats qui sortiront de cette première phase devront être présentés avec la prudence suivante :</w:t>
-      </w:r>
-    </w:p>
-    <w:p>
-      <w:pPr>
-        <w:pStyle w:val="Compact"/>
-        <w:numPr>
-          <w:ilvl w:val="0"/>
-          <w:numId w:val="31"/>
-        </w:numPr>
-        <w:rPr>
-          <w:rFonts w:ascii="Arial" w:hAnsi="Arial" w:cs="Arial"/>
-          <w:lang w:val="fr-FR"/>
-        </w:rPr>
-      </w:pPr>
-      <w:proofErr w:type="gramStart"/>
-      <w:r>
-        <w:rPr>
-          <w:rFonts w:ascii="Arial" w:hAnsi="Arial" w:cs="Arial"/>
-          <w:lang w:val="fr-FR"/>
-        </w:rPr>
-        <w:t>ils</w:t>
-      </w:r>
-      <w:proofErr w:type="gramEnd"/>
-      <w:r>
-        <w:rPr>
-          <w:rFonts w:ascii="Arial" w:hAnsi="Arial" w:cs="Arial"/>
-          <w:lang w:val="fr-FR"/>
-        </w:rPr>
-        <w:t xml:space="preserve"> décrivent une incidence simulée de premier ordre ;</w:t>
-      </w:r>
-    </w:p>
-    <w:p>
-      <w:pPr>
-        <w:pStyle w:val="Compact"/>
-        <w:numPr>
-          <w:ilvl w:val="0"/>
-          <w:numId w:val="31"/>
-        </w:numPr>
-        <w:rPr>
-          <w:rFonts w:ascii="Arial" w:hAnsi="Arial" w:cs="Arial"/>
-          <w:lang w:val="fr-FR"/>
-        </w:rPr>
-      </w:pPr>
-      <w:proofErr w:type="gramStart"/>
-      <w:r>
-        <w:rPr>
-          <w:rFonts w:ascii="Arial" w:hAnsi="Arial" w:cs="Arial"/>
-          <w:lang w:val="fr-FR"/>
-        </w:rPr>
-        <w:t>ils</w:t>
-      </w:r>
-      <w:proofErr w:type="gramEnd"/>
-      <w:r>
-        <w:rPr>
-          <w:rFonts w:ascii="Arial" w:hAnsi="Arial" w:cs="Arial"/>
-          <w:lang w:val="fr-FR"/>
-        </w:rPr>
-        <w:t xml:space="preserve"> ne représentent pas encore l’incidence fiscale totale du système ;</w:t>
-      </w:r>
-    </w:p>
-    <w:p>
-      <w:pPr>
-        <w:pStyle w:val="Compact"/>
-        <w:numPr>
-          <w:ilvl w:val="0"/>
-          <w:numId w:val="31"/>
-        </w:numPr>
-        <w:rPr>
-          <w:rFonts w:ascii="Arial" w:hAnsi="Arial" w:cs="Arial"/>
-          <w:lang w:val="fr-FR"/>
-        </w:rPr>
-      </w:pPr>
-      <w:proofErr w:type="gramStart"/>
-      <w:r>
-        <w:rPr>
-          <w:rFonts w:ascii="Arial" w:hAnsi="Arial" w:cs="Arial"/>
-          <w:lang w:val="fr-FR"/>
-        </w:rPr>
-        <w:lastRenderedPageBreak/>
-        <w:t>ils</w:t>
-      </w:r>
-      <w:proofErr w:type="gramEnd"/>
-      <w:r>
-        <w:rPr>
-          <w:rFonts w:ascii="Arial" w:hAnsi="Arial" w:cs="Arial"/>
-          <w:lang w:val="fr-FR"/>
-        </w:rPr>
-        <w:t xml:space="preserve"> dépendent d’hypothèses explicites sur le traitement fiscal des produits et sur la répercussion dans les prix ;</w:t>
-      </w:r>
-    </w:p>
-    <w:p>
-      <w:pPr>
-        <w:pStyle w:val="Compact"/>
-        <w:numPr>
-          <w:ilvl w:val="0"/>
-          <w:numId w:val="31"/>
-        </w:numPr>
-        <w:rPr>
-          <w:rFonts w:ascii="Arial" w:hAnsi="Arial" w:cs="Arial"/>
-          <w:lang w:val="fr-FR"/>
-        </w:rPr>
-      </w:pPr>
-      <w:proofErr w:type="gramStart"/>
-      <w:r>
-        <w:rPr>
-          <w:rFonts w:ascii="Arial" w:hAnsi="Arial" w:cs="Arial"/>
-          <w:lang w:val="fr-FR"/>
-        </w:rPr>
-        <w:t>ils</w:t>
-      </w:r>
-      <w:proofErr w:type="gramEnd"/>
-      <w:r>
-        <w:rPr>
-          <w:rFonts w:ascii="Arial" w:hAnsi="Arial" w:cs="Arial"/>
-          <w:lang w:val="fr-FR"/>
-        </w:rPr>
-        <w:t xml:space="preserve"> sont néanmoins très informatifs pour documenter les profils distributifs de la taxation de la consommation.</w:t>
-      </w:r>
-    </w:p>
-    <w:p>
-      <w:pPr>
-        <w:pStyle w:val="FirstParagraph"/>
-        <w:rPr>
-          <w:rFonts w:ascii="Arial" w:hAnsi="Arial" w:cs="Arial"/>
-          <w:lang w:val="fr-FR"/>
-        </w:rPr>
-      </w:pPr>
-      <w:r>
-        <w:rPr>
-          <w:rFonts w:ascii="Arial" w:hAnsi="Arial" w:cs="Arial"/>
-          <w:lang w:val="fr-FR"/>
-        </w:rPr>
-        <w:t>Cette prudence renforcera la crédibilité du travail plutôt que de l’affaiblir.</w:t>
-      </w:r>
-    </w:p>
-    <w:p>
-      <w:pPr>
-        <w:rPr>
-          <w:rFonts w:ascii="Arial" w:hAnsi="Arial" w:cs="Arial"/>
-        </w:rPr>
-      </w:pPr>
-      <w:r>
-        <w:rPr>
-          <w:rFonts w:ascii="Arial" w:hAnsi="Arial" w:cs="Arial"/>
-        </w:rPr>
-        <w:pict w14:anchorId="2093D3BC">
-          <v:rect id="_x0000_i1050" style="width:0;height:1.5pt" o:hralign="center" o:hrstd="t" o:hr="t"/>
-        </w:pict>
-      </w:r>
-    </w:p>
-    <w:p>
-      <w:pPr>
-        <w:pStyle w:val="Heading2"/>
-        <w:rPr>
-          <w:rFonts w:ascii="Arial" w:hAnsi="Arial" w:cs="Arial"/>
-          <w:lang w:val="fr-FR"/>
-        </w:rPr>
-      </w:pPr>
-      <w:bookmarkStart w:id="92" w:name="Xacc971b5ff0e601b5a7b656bafe996703119188"/>
-      <w:bookmarkEnd w:id="91"/>
-      <w:r>
-        <w:rPr>
-          <w:rFonts w:ascii="Arial" w:hAnsi="Arial" w:cs="Arial"/>
-          <w:lang w:val="fr-FR"/>
-        </w:rPr>
-        <w:t>26. Références de base à mobiliser dans la version finale</w:t>
-      </w:r>
-    </w:p>
-    <w:p>
-      <w:pPr>
-        <w:pStyle w:val="Compact"/>
-        <w:numPr>
-          <w:ilvl w:val="0"/>
-          <w:numId w:val="32"/>
-        </w:numPr>
-        <w:rPr>
-          <w:rFonts w:ascii="Arial" w:hAnsi="Arial" w:cs="Arial"/>
-        </w:rPr>
-      </w:pPr>
-      <w:proofErr w:type="spellStart"/>
-      <w:r>
-        <w:rPr>
-          <w:rFonts w:ascii="Arial" w:hAnsi="Arial" w:cs="Arial"/>
-          <w:lang w:val="fr-FR"/>
-        </w:rPr>
-        <w:t>Inchauste</w:t>
-      </w:r>
-      <w:proofErr w:type="spellEnd"/>
-      <w:r>
-        <w:rPr>
-          <w:rFonts w:ascii="Arial" w:hAnsi="Arial" w:cs="Arial"/>
-          <w:lang w:val="fr-FR"/>
-        </w:rPr>
-        <w:t>, G., et Lustig, N. (</w:t>
-      </w:r>
-      <w:proofErr w:type="spellStart"/>
-      <w:r>
-        <w:rPr>
-          <w:rFonts w:ascii="Arial" w:hAnsi="Arial" w:cs="Arial"/>
-          <w:lang w:val="fr-FR"/>
-        </w:rPr>
-        <w:t>eds</w:t>
-      </w:r>
-      <w:proofErr w:type="spellEnd"/>
-      <w:r>
-        <w:rPr>
-          <w:rFonts w:ascii="Arial" w:hAnsi="Arial" w:cs="Arial"/>
-          <w:lang w:val="fr-FR"/>
-        </w:rPr>
-        <w:t xml:space="preserve">.). </w:t>
-      </w:r>
-      <w:r>
-        <w:rPr>
-          <w:rFonts w:ascii="Arial" w:hAnsi="Arial" w:cs="Arial"/>
-          <w:i/>
-          <w:iCs/>
-        </w:rPr>
-        <w:t>The Distributional Impact of Taxes and Transfers: Evidence from Eight Low- and Middle-Income Countries</w:t>
-      </w:r>
-      <w:r>
-        <w:rPr>
-          <w:rFonts w:ascii="Arial" w:hAnsi="Arial" w:cs="Arial"/>
-        </w:rPr>
-        <w:t>.</w:t>
-      </w:r>
-    </w:p>
-    <w:p>
-      <w:pPr>
-        <w:pStyle w:val="Compact"/>
-        <w:numPr>
-          <w:ilvl w:val="0"/>
-          <w:numId w:val="32"/>
-        </w:numPr>
-        <w:rPr>
-          <w:rFonts w:ascii="Arial" w:hAnsi="Arial" w:cs="Arial"/>
-        </w:rPr>
-      </w:pPr>
-      <w:r>
-        <w:rPr>
-          <w:rFonts w:ascii="Arial" w:hAnsi="Arial" w:cs="Arial"/>
-        </w:rPr>
-        <w:t xml:space="preserve">Lustig, N. </w:t>
-      </w:r>
-      <w:r>
-        <w:rPr>
-          <w:rFonts w:ascii="Arial" w:hAnsi="Arial" w:cs="Arial"/>
-          <w:i/>
-          <w:iCs/>
-        </w:rPr>
-        <w:t>Commitment to Equity Handbook: Estimating the Impact of Fiscal Policy on Inequality and Poverty</w:t>
-      </w:r>
-      <w:r>
-        <w:rPr>
-          <w:rFonts w:ascii="Arial" w:hAnsi="Arial" w:cs="Arial"/>
-        </w:rPr>
-        <w:t>.</w:t>
-      </w:r>
-    </w:p>
-    <w:p>
-      <w:pPr>
-        <w:pStyle w:val="Compact"/>
-        <w:numPr>
-          <w:ilvl w:val="0"/>
-          <w:numId w:val="32"/>
-        </w:numPr>
-        <w:rPr>
-          <w:rFonts w:ascii="Arial" w:hAnsi="Arial" w:cs="Arial"/>
-        </w:rPr>
-      </w:pPr>
-      <w:r>
-        <w:rPr>
-          <w:rFonts w:ascii="Arial" w:hAnsi="Arial" w:cs="Arial"/>
-        </w:rPr>
-        <w:t xml:space="preserve">Demery, L. </w:t>
-      </w:r>
-      <w:r>
-        <w:rPr>
-          <w:rFonts w:ascii="Arial" w:hAnsi="Arial" w:cs="Arial"/>
-          <w:i/>
-          <w:iCs/>
-        </w:rPr>
-        <w:t>Benefit Incidence: A Practitioner’s Guide</w:t>
-      </w:r>
-      <w:r>
-        <w:rPr>
-          <w:rFonts w:ascii="Arial" w:hAnsi="Arial" w:cs="Arial"/>
-        </w:rPr>
-        <w:t>.</w:t>
-      </w:r>
-    </w:p>
-    <w:p>
-      <w:pPr>
-        <w:pStyle w:val="Compact"/>
-        <w:numPr>
-          <w:ilvl w:val="0"/>
-          <w:numId w:val="32"/>
-        </w:numPr>
-        <w:rPr>
-          <w:rFonts w:ascii="Arial" w:hAnsi="Arial" w:cs="Arial"/>
-        </w:rPr>
-      </w:pPr>
-      <w:r>
-        <w:rPr>
-          <w:rFonts w:ascii="Arial" w:hAnsi="Arial" w:cs="Arial"/>
-        </w:rPr>
-        <w:t xml:space="preserve">Deaton, A. et Zaidi, S. </w:t>
-      </w:r>
-      <w:r>
-        <w:rPr>
-          <w:rFonts w:ascii="Arial" w:hAnsi="Arial" w:cs="Arial"/>
-          <w:i/>
-          <w:iCs/>
-        </w:rPr>
-        <w:t>Guidelines for Constructing Consumption Aggregates for Welfare Analysis</w:t>
-      </w:r>
-      <w:r>
-        <w:rPr>
-          <w:rFonts w:ascii="Arial" w:hAnsi="Arial" w:cs="Arial"/>
-        </w:rPr>
-        <w:t>.</w:t>
-      </w:r>
-    </w:p>
-    <w:p>
-      <w:pPr>
-        <w:pStyle w:val="Compact"/>
-        <w:numPr>
-          <w:ilvl w:val="0"/>
-          <w:numId w:val="32"/>
-        </w:numPr>
-        <w:rPr>
-          <w:rFonts w:ascii="Arial" w:hAnsi="Arial" w:cs="Arial"/>
-        </w:rPr>
-      </w:pPr>
-      <w:r>
-        <w:rPr>
-          <w:rFonts w:ascii="Arial" w:hAnsi="Arial" w:cs="Arial"/>
-        </w:rPr>
-        <w:t>Documentation officielle de l’EHCVM.</w:t>
-      </w:r>
-    </w:p>
-    <w:p>
-      <w:pPr>
-        <w:pStyle w:val="Compact"/>
-        <w:numPr>
-          <w:ilvl w:val="0"/>
-          <w:numId w:val="32"/>
-        </w:numPr>
-        <w:rPr>
-          <w:rFonts w:ascii="Arial" w:hAnsi="Arial" w:cs="Arial"/>
-          <w:lang w:val="fr-FR"/>
-        </w:rPr>
-      </w:pPr>
-      <w:r>
-        <w:rPr>
-          <w:rFonts w:ascii="Arial" w:hAnsi="Arial" w:cs="Arial"/>
-          <w:lang w:val="fr-FR"/>
-        </w:rPr>
-        <w:t>Code général des impôts de Côte d’Ivoire et textes d’application pertinents.</w:t>
-      </w:r>
-    </w:p>
-    <w:p>
-      <w:pPr>
-        <w:pStyle w:val="Compact"/>
-        <w:numPr>
-          <w:ilvl w:val="0"/>
-          <w:numId w:val="32"/>
-        </w:numPr>
-        <w:rPr>
-          <w:rFonts w:ascii="Arial" w:hAnsi="Arial" w:cs="Arial"/>
-          <w:lang w:val="fr-FR"/>
-        </w:rPr>
-      </w:pPr>
-      <w:r>
-        <w:rPr>
-          <w:rFonts w:ascii="Arial" w:hAnsi="Arial" w:cs="Arial"/>
-          <w:lang w:val="fr-FR"/>
-        </w:rPr>
-        <w:t>Documentation administrative sur les recettes de TVA et d’accises en Côte d’Ivoire.</w:t>
-      </w:r>
-    </w:p>
-    <w:p>
-      <w:pPr>
-        <w:rPr>
-          <w:rFonts w:ascii="Arial" w:hAnsi="Arial" w:cs="Arial"/>
-        </w:rPr>
-      </w:pPr>
-      <w:r>
-        <w:rPr>
-          <w:rFonts w:ascii="Arial" w:hAnsi="Arial" w:cs="Arial"/>
-        </w:rPr>
-        <w:pict w14:anchorId="622EA471">
-          <v:rect id="_x0000_i1051" style="width:0;height:1.5pt" o:hralign="center" o:hrstd="t" o:hr="t"/>
-        </w:pict>
-      </w:r>
-    </w:p>
-    <w:p>
-      <w:pPr>
-        <w:pStyle w:val="Heading2"/>
-        <w:rPr>
-          <w:rFonts w:ascii="Arial" w:hAnsi="Arial" w:cs="Arial"/>
-          <w:lang w:val="fr-FR"/>
-        </w:rPr>
-      </w:pPr>
       <w:bookmarkStart w:id="93" w:name="conclusion-générale"/>
       <w:bookmarkEnd w:id="92"/>
       <w:r>
@@ -8511,7 +8604,7 @@
           <w:rFonts w:ascii="Arial" w:hAnsi="Arial" w:cs="Arial"/>
         </w:rPr>
         <w:pict w14:anchorId="32677864">
-          <v:rect id="_x0000_i1052" style="width:0;height:1.5pt" o:hralign="center" o:hrstd="t" o:hr="t"/>
+          <v:rect id="_x0000_i1050" style="width:0;height:1.5pt" o:hralign="center" o:hrstd="t" o:hr="t"/>
         </w:pict>
       </w:r>
     </w:p>
@@ -9423,6 +9516,210 @@
       <w:pPr>
         <w:ind w:left="6480" w:hanging="360"/>
       </w:pPr>
+    </w:lvl>
+  </w:abstractNum>
+  <w:abstractNum w:abstractNumId="3" w15:restartNumberingAfterBreak="0">
+    <w:nsid w:val="121D1842"/>
+    <w:multiLevelType w:val="hybridMultilevel"/>
+    <w:tmpl w:val="4DC88A82"/>
+    <w:lvl w:ilvl="0" w:tplc="9E36220E">
+      <w:start w:val="1"/>
+      <w:numFmt w:val="decimal"/>
+      <w:lvlText w:val="%1."/>
+      <w:lvlJc w:val="left"/>
+      <w:pPr>
+        <w:ind w:left="720" w:hanging="360"/>
+      </w:pPr>
+      <w:rPr>
+        <w:b/>
+        <w:bCs/>
+        <w:color w:val="000000" w:themeColor="text1"/>
+      </w:rPr>
+    </w:lvl>
+    <w:lvl w:ilvl="1" w:tplc="040C0019" w:tentative="1">
+      <w:start w:val="1"/>
+      <w:numFmt w:val="lowerLetter"/>
+      <w:lvlText w:val="%2."/>
+      <w:lvlJc w:val="left"/>
+      <w:pPr>
+        <w:ind w:left="1440" w:hanging="360"/>
+      </w:pPr>
+    </w:lvl>
+    <w:lvl w:ilvl="2" w:tplc="040C001B" w:tentative="1">
+      <w:start w:val="1"/>
+      <w:numFmt w:val="lowerRoman"/>
+      <w:lvlText w:val="%3."/>
+      <w:lvlJc w:val="right"/>
+      <w:pPr>
+        <w:ind w:left="2160" w:hanging="180"/>
+      </w:pPr>
+    </w:lvl>
+    <w:lvl w:ilvl="3" w:tplc="040C000F" w:tentative="1">
+      <w:start w:val="1"/>
+      <w:numFmt w:val="decimal"/>
+      <w:lvlText w:val="%4."/>
+      <w:lvlJc w:val="left"/>
+      <w:pPr>
+        <w:ind w:left="2880" w:hanging="360"/>
+      </w:pPr>
+    </w:lvl>
+    <w:lvl w:ilvl="4" w:tplc="040C0019" w:tentative="1">
+      <w:start w:val="1"/>
+      <w:numFmt w:val="lowerLetter"/>
+      <w:lvlText w:val="%5."/>
+      <w:lvlJc w:val="left"/>
+      <w:pPr>
+        <w:ind w:left="3600" w:hanging="360"/>
+      </w:pPr>
+    </w:lvl>
+    <w:lvl w:ilvl="5" w:tplc="040C001B" w:tentative="1">
+      <w:start w:val="1"/>
+      <w:numFmt w:val="lowerRoman"/>
+      <w:lvlText w:val="%6."/>
+      <w:lvlJc w:val="right"/>
+      <w:pPr>
+        <w:ind w:left="4320" w:hanging="180"/>
+      </w:pPr>
+    </w:lvl>
+    <w:lvl w:ilvl="6" w:tplc="040C000F" w:tentative="1">
+      <w:start w:val="1"/>
+      <w:numFmt w:val="decimal"/>
+      <w:lvlText w:val="%7."/>
+      <w:lvlJc w:val="left"/>
+      <w:pPr>
+        <w:ind w:left="5040" w:hanging="360"/>
+      </w:pPr>
+    </w:lvl>
+    <w:lvl w:ilvl="7" w:tplc="040C0019" w:tentative="1">
+      <w:start w:val="1"/>
+      <w:numFmt w:val="lowerLetter"/>
+      <w:lvlText w:val="%8."/>
+      <w:lvlJc w:val="left"/>
+      <w:pPr>
+        <w:ind w:left="5760" w:hanging="360"/>
+      </w:pPr>
+    </w:lvl>
+    <w:lvl w:ilvl="8" w:tplc="040C001B" w:tentative="1">
+      <w:start w:val="1"/>
+      <w:numFmt w:val="lowerRoman"/>
+      <w:lvlText w:val="%9."/>
+      <w:lvlJc w:val="right"/>
+      <w:pPr>
+        <w:ind w:left="6480" w:hanging="180"/>
+      </w:pPr>
+    </w:lvl>
+  </w:abstractNum>
+  <w:abstractNum w:abstractNumId="4" w15:restartNumberingAfterBreak="0">
+    <w:nsid w:val="2E45466B"/>
+    <w:multiLevelType w:val="hybridMultilevel"/>
+    <w:tmpl w:val="7F6A6286"/>
+    <w:lvl w:ilvl="0" w:tplc="040C0001">
+      <w:start w:val="1"/>
+      <w:numFmt w:val="bullet"/>
+      <w:lvlText w:val=""/>
+      <w:lvlJc w:val="left"/>
+      <w:pPr>
+        <w:ind w:left="720" w:hanging="360"/>
+      </w:pPr>
+      <w:rPr>
+        <w:rFonts w:ascii="Symbol" w:hAnsi="Symbol" w:hint="default"/>
+      </w:rPr>
+    </w:lvl>
+    <w:lvl w:ilvl="1" w:tplc="040C0003" w:tentative="1">
+      <w:start w:val="1"/>
+      <w:numFmt w:val="bullet"/>
+      <w:lvlText w:val="o"/>
+      <w:lvlJc w:val="left"/>
+      <w:pPr>
+        <w:ind w:left="1440" w:hanging="360"/>
+      </w:pPr>
+      <w:rPr>
+        <w:rFonts w:ascii="Courier New" w:hAnsi="Courier New" w:cs="Courier New" w:hint="default"/>
+      </w:rPr>
+    </w:lvl>
+    <w:lvl w:ilvl="2" w:tplc="040C0005" w:tentative="1">
+      <w:start w:val="1"/>
+      <w:numFmt w:val="bullet"/>
+      <w:lvlText w:val=""/>
+      <w:lvlJc w:val="left"/>
+      <w:pPr>
+        <w:ind w:left="2160" w:hanging="360"/>
+      </w:pPr>
+      <w:rPr>
+        <w:rFonts w:ascii="Wingdings" w:hAnsi="Wingdings" w:hint="default"/>
+      </w:rPr>
+    </w:lvl>
+    <w:lvl w:ilvl="3" w:tplc="040C0001" w:tentative="1">
+      <w:start w:val="1"/>
+      <w:numFmt w:val="bullet"/>
+      <w:lvlText w:val=""/>
+      <w:lvlJc w:val="left"/>
+      <w:pPr>
+        <w:ind w:left="2880" w:hanging="360"/>
+      </w:pPr>
+      <w:rPr>
+        <w:rFonts w:ascii="Symbol" w:hAnsi="Symbol" w:hint="default"/>
+      </w:rPr>
+    </w:lvl>
+    <w:lvl w:ilvl="4" w:tplc="040C0003" w:tentative="1">
+      <w:start w:val="1"/>
+      <w:numFmt w:val="bullet"/>
+      <w:lvlText w:val="o"/>
+      <w:lvlJc w:val="left"/>
+      <w:pPr>
+        <w:ind w:left="3600" w:hanging="360"/>
+      </w:pPr>
+      <w:rPr>
+        <w:rFonts w:ascii="Courier New" w:hAnsi="Courier New" w:cs="Courier New" w:hint="default"/>
+      </w:rPr>
+    </w:lvl>
+    <w:lvl w:ilvl="5" w:tplc="040C0005" w:tentative="1">
+      <w:start w:val="1"/>
+      <w:numFmt w:val="bullet"/>
+      <w:lvlText w:val=""/>
+      <w:lvlJc w:val="left"/>
+      <w:pPr>
+        <w:ind w:left="4320" w:hanging="360"/>
+      </w:pPr>
+      <w:rPr>
+        <w:rFonts w:ascii="Wingdings" w:hAnsi="Wingdings" w:hint="default"/>
+      </w:rPr>
+    </w:lvl>
+    <w:lvl w:ilvl="6" w:tplc="040C0001" w:tentative="1">
+      <w:start w:val="1"/>
+      <w:numFmt w:val="bullet"/>
+      <w:lvlText w:val=""/>
+      <w:lvlJc w:val="left"/>
+      <w:pPr>
+        <w:ind w:left="5040" w:hanging="360"/>
+      </w:pPr>
+      <w:rPr>
+        <w:rFonts w:ascii="Symbol" w:hAnsi="Symbol" w:hint="default"/>
+      </w:rPr>
+    </w:lvl>
+    <w:lvl w:ilvl="7" w:tplc="040C0003" w:tentative="1">
+      <w:start w:val="1"/>
+      <w:numFmt w:val="bullet"/>
+      <w:lvlText w:val="o"/>
+      <w:lvlJc w:val="left"/>
+      <w:pPr>
+        <w:ind w:left="5760" w:hanging="360"/>
+      </w:pPr>
+      <w:rPr>
+        <w:rFonts w:ascii="Courier New" w:hAnsi="Courier New" w:cs="Courier New" w:hint="default"/>
+      </w:rPr>
+    </w:lvl>
+    <w:lvl w:ilvl="8" w:tplc="040C0005" w:tentative="1">
+      <w:start w:val="1"/>
+      <w:numFmt w:val="bullet"/>
+      <w:lvlText w:val=""/>
+      <w:lvlJc w:val="left"/>
+      <w:pPr>
+        <w:ind w:left="6480" w:hanging="360"/>
+      </w:pPr>
+      <w:rPr>
+        <w:rFonts w:ascii="Wingdings" w:hAnsi="Wingdings" w:hint="default"/>
+      </w:rPr>
     </w:lvl>
   </w:abstractNum>
   <w:num w:numId="1" w16cid:durableId="244531193">
@@ -9583,6 +9880,12 @@
   </w:num>
   <w:num w:numId="35" w16cid:durableId="49422651">
     <w:abstractNumId w:val="1"/>
+  </w:num>
+  <w:num w:numId="36" w16cid:durableId="666203907">
+    <w:abstractNumId w:val="3"/>
+  </w:num>
+  <w:num w:numId="37" w16cid:durableId="988705183">
+    <w:abstractNumId w:val="4"/>
   </w:num>
 </w:numbering>
 </file>
@@ -10106,18 +10409,21 @@
     <w:link w:val="TitleChar"/>
     <w:uiPriority w:val="10"/>
     <w:qFormat/>
-    <w:rsid w:val="00A10FD9"/>
+    <w:rsid w:val="00C92DA1"/>
     <w:pPr>
       <w:spacing w:after="80"/>
       <w:contextualSpacing/>
       <w:jc w:val="center"/>
     </w:pPr>
     <w:rPr>
-      <w:rFonts w:asciiTheme="majorHAnsi" w:eastAsiaTheme="majorEastAsia" w:hAnsiTheme="majorHAnsi" w:cstheme="majorBidi"/>
+      <w:rFonts w:ascii="Arial" w:eastAsiaTheme="majorEastAsia" w:hAnsi="Arial" w:cstheme="majorBidi"/>
+      <w:b/>
+      <w:color w:val="000000" w:themeColor="text1"/>
       <w:spacing w:val="-10"/>
       <w:kern w:val="28"/>
-      <w:sz w:val="56"/>
+      <w:sz w:val="40"/>
       <w:szCs w:val="56"/>
+      <w:u w:val="single"/>
     </w:rPr>
   </w:style>
   <w:style w:type="character" w:customStyle="1" w:styleId="TitleChar">
@@ -10125,13 +10431,16 @@
     <w:basedOn w:val="DefaultParagraphFont"/>
     <w:link w:val="Title"/>
     <w:uiPriority w:val="10"/>
-    <w:rsid w:val="00A10FD9"/>
+    <w:rsid w:val="00C92DA1"/>
     <w:rPr>
-      <w:rFonts w:asciiTheme="majorHAnsi" w:eastAsiaTheme="majorEastAsia" w:hAnsiTheme="majorHAnsi" w:cstheme="majorBidi"/>
+      <w:rFonts w:ascii="Arial" w:eastAsiaTheme="majorEastAsia" w:hAnsi="Arial" w:cstheme="majorBidi"/>
+      <w:b/>
+      <w:color w:val="000000" w:themeColor="text1"/>
       <w:spacing w:val="-10"/>
       <w:kern w:val="28"/>
-      <w:sz w:val="56"/>
+      <w:sz w:val="40"/>
       <w:szCs w:val="56"/>
+      <w:u w:val="single"/>
     </w:rPr>
   </w:style>
   <w:style w:type="paragraph" w:styleId="Subtitle">

</xml_diff>